<commit_message>
Delete button --> Dispose button
</commit_message>
<xml_diff>
--- a/frontend/public/LDCU-Forms-CIT-033-Laboratory Borrowing of Equipment Faculty.docx
+++ b/frontend/public/LDCU-Forms-CIT-033-Laboratory Borrowing of Equipment Faculty.docx
@@ -1,21 +1,20 @@
 
 <file path=word/document.xml><?xml version="1.0" encoding="utf-8"?>
-<w:document xmlns:o="urn:schemas-microsoft-com:office:office" xmlns:r="http://schemas.openxmlformats.org/officeDocument/2006/relationships" xmlns:v="urn:schemas-microsoft-com:vml" xmlns:w="http://schemas.openxmlformats.org/wordprocessingml/2006/main" xmlns:w10="urn:schemas-microsoft-com:office:word" xmlns:wp="http://schemas.openxmlformats.org/drawingml/2006/wordprocessingDrawing" xmlns:wps="http://schemas.microsoft.com/office/word/2010/wordprocessingShape" xmlns:wpg="http://schemas.microsoft.com/office/word/2010/wordprocessingGroup" xmlns:mc="http://schemas.openxmlformats.org/markup-compatibility/2006" xmlns:wp14="http://schemas.microsoft.com/office/word/2010/wordprocessingDrawing" xmlns:w14="http://schemas.microsoft.com/office/word/2010/wordml" xmlns:w15="http://schemas.microsoft.com/office/word/2012/wordml" mc:Ignorable="w14 wp14 w15">
+<w:document xmlns:wpc="http://schemas.microsoft.com/office/word/2010/wordprocessingCanvas" xmlns:cx="http://schemas.microsoft.com/office/drawing/2014/chartex" xmlns:mc="http://schemas.openxmlformats.org/markup-compatibility/2006" xmlns:o="urn:schemas-microsoft-com:office:office" xmlns:r="http://schemas.openxmlformats.org/officeDocument/2006/relationships" xmlns:m="http://schemas.openxmlformats.org/officeDocument/2006/math" xmlns:v="urn:schemas-microsoft-com:vml" xmlns:wp14="http://schemas.microsoft.com/office/word/2010/wordprocessingDrawing" xmlns:wp="http://schemas.openxmlformats.org/drawingml/2006/wordprocessingDrawing" xmlns:w10="urn:schemas-microsoft-com:office:word" xmlns:w="http://schemas.openxmlformats.org/wordprocessingml/2006/main" xmlns:w14="http://schemas.microsoft.com/office/word/2010/wordml" xmlns:w15="http://schemas.microsoft.com/office/word/2012/wordml" xmlns:w16se="http://schemas.microsoft.com/office/word/2015/wordml/symex" xmlns:wpg="http://schemas.microsoft.com/office/word/2010/wordprocessingGroup" xmlns:wpi="http://schemas.microsoft.com/office/word/2010/wordprocessingInk" xmlns:wne="http://schemas.microsoft.com/office/word/2006/wordml" xmlns:wps="http://schemas.microsoft.com/office/word/2010/wordprocessingShape" mc:Ignorable="w14 w15 w16se wp14">
   <w:body>
     <w:p>
       <w:pPr>
-        <w:pStyle w:val="Normal"/>
-        <w:spacing w:lineRule="auto" w:line="240" w:before="0" w:after="0"/>
+        <w:spacing w:after="0" w:line="240" w:lineRule="auto"/>
         <w:jc w:val="center"/>
         <w:rPr>
-          <w:rFonts w:ascii="Cambria" w:hAnsi="Cambria" w:eastAsia="Cambria" w:cs="Cambria"/>
+          <w:rFonts w:ascii="Cambria" w:eastAsia="Cambria" w:hAnsi="Cambria" w:cs="Cambria"/>
           <w:sz w:val="20"/>
           <w:szCs w:val="20"/>
         </w:rPr>
       </w:pPr>
       <w:r>
         <w:rPr>
-          <w:rFonts w:eastAsia="Cambria" w:cs="Cambria" w:ascii="Cambria" w:hAnsi="Cambria"/>
+          <w:rFonts w:ascii="Cambria" w:eastAsia="Cambria" w:hAnsi="Cambria" w:cs="Cambria"/>
           <w:sz w:val="20"/>
           <w:szCs w:val="20"/>
         </w:rPr>
@@ -24,11 +23,10 @@
     </w:p>
     <w:p>
       <w:pPr>
-        <w:pStyle w:val="Normal"/>
-        <w:spacing w:lineRule="auto" w:line="240" w:before="0" w:after="0"/>
+        <w:spacing w:after="0" w:line="240" w:lineRule="auto"/>
         <w:jc w:val="center"/>
         <w:rPr>
-          <w:rFonts w:ascii="Cambria" w:hAnsi="Cambria" w:eastAsia="Cambria" w:cs="Cambria"/>
+          <w:rFonts w:ascii="Cambria" w:eastAsia="Cambria" w:hAnsi="Cambria" w:cs="Cambria"/>
           <w:b/>
           <w:sz w:val="18"/>
           <w:szCs w:val="18"/>
@@ -36,7 +34,7 @@
       </w:pPr>
       <w:r>
         <w:rPr>
-          <w:rFonts w:eastAsia="Cambria" w:cs="Cambria" w:ascii="Cambria" w:hAnsi="Cambria"/>
+          <w:rFonts w:ascii="Cambria" w:eastAsia="Cambria" w:hAnsi="Cambria" w:cs="Cambria"/>
           <w:b/>
           <w:sz w:val="18"/>
           <w:szCs w:val="18"/>
@@ -46,143 +44,356 @@
     </w:p>
     <w:p>
       <w:pPr>
-        <w:pStyle w:val="Normal"/>
-        <w:spacing w:lineRule="auto" w:line="240" w:before="0" w:after="0"/>
+        <w:spacing w:after="0" w:line="240" w:lineRule="auto"/>
         <w:jc w:val="center"/>
         <w:rPr>
-          <w:rFonts w:ascii="Cambria" w:hAnsi="Cambria" w:eastAsia="Cambria" w:cs="Cambria"/>
+          <w:rFonts w:ascii="Cambria" w:eastAsia="Cambria" w:hAnsi="Cambria" w:cs="Cambria"/>
           <w:b/>
+          <w:sz w:val="10"/>
+          <w:szCs w:val="18"/>
+        </w:rPr>
+      </w:pPr>
+    </w:p>
+    <w:tbl>
+      <w:tblPr>
+        <w:tblpPr w:leftFromText="180" w:rightFromText="180" w:vertAnchor="text" w:tblpX="11" w:tblpY="21"/>
+        <w:tblW w:w="0" w:type="auto"/>
+        <w:tblBorders>
+          <w:top w:val="single" w:sz="4" w:space="0" w:color="auto"/>
+          <w:left w:val="single" w:sz="4" w:space="0" w:color="auto"/>
+          <w:bottom w:val="single" w:sz="4" w:space="0" w:color="auto"/>
+          <w:right w:val="single" w:sz="4" w:space="0" w:color="auto"/>
+          <w:insideH w:val="single" w:sz="4" w:space="0" w:color="auto"/>
+          <w:insideV w:val="single" w:sz="4" w:space="0" w:color="auto"/>
+        </w:tblBorders>
+        <w:tblLayout w:type="fixed"/>
+        <w:tblLook w:val="0000" w:firstRow="0" w:lastRow="0" w:firstColumn="0" w:lastColumn="0" w:noHBand="0" w:noVBand="0"/>
+      </w:tblPr>
+      <w:tblGrid>
+        <w:gridCol w:w="2670"/>
+        <w:gridCol w:w="2950"/>
+      </w:tblGrid>
+      <w:tr>
+        <w:trPr>
+          <w:trHeight w:val="130"/>
+        </w:trPr>
+        <w:tc>
+          <w:tcPr>
+            <w:tcW w:w="2670" w:type="dxa"/>
+            <w:tcBorders>
+              <w:top w:val="nil"/>
+              <w:left w:val="nil"/>
+              <w:bottom w:val="nil"/>
+              <w:right w:val="nil"/>
+            </w:tcBorders>
+          </w:tcPr>
+          <w:p>
+            <w:pPr>
+              <w:spacing w:after="0" w:line="240" w:lineRule="auto"/>
+              <w:rPr>
+                <w:rFonts w:ascii="Cambria" w:eastAsia="Cambria" w:hAnsi="Cambria" w:cs="Cambria"/>
+                <w:sz w:val="18"/>
+                <w:szCs w:val="18"/>
+              </w:rPr>
+            </w:pPr>
+            <w:r>
+              <w:rPr>
+                <w:rFonts w:ascii="Cambria" w:eastAsia="Cambria" w:hAnsi="Cambria" w:cs="Cambria"/>
+                <w:sz w:val="18"/>
+                <w:szCs w:val="18"/>
+              </w:rPr>
+              <w:t xml:space="preserve">Date: {date}        </w:t>
+            </w:r>
+          </w:p>
+        </w:tc>
+        <w:tc>
+          <w:tcPr>
+            <w:tcW w:w="2950" w:type="dxa"/>
+            <w:tcBorders>
+              <w:top w:val="nil"/>
+              <w:left w:val="nil"/>
+              <w:bottom w:val="nil"/>
+              <w:right w:val="nil"/>
+            </w:tcBorders>
+            <w:shd w:val="clear" w:color="auto" w:fill="auto"/>
+          </w:tcPr>
+          <w:p>
+            <w:pPr>
+              <w:spacing w:after="0" w:line="240" w:lineRule="auto"/>
+              <w:rPr>
+                <w:rFonts w:ascii="Cambria" w:eastAsia="Cambria" w:hAnsi="Cambria" w:cs="Cambria"/>
+                <w:sz w:val="18"/>
+                <w:szCs w:val="18"/>
+              </w:rPr>
+            </w:pPr>
+            <w:r>
+              <w:rPr>
+                <w:rFonts w:ascii="Cambria" w:eastAsia="Cambria" w:hAnsi="Cambria" w:cs="Cambria"/>
+                <w:sz w:val="18"/>
+                <w:szCs w:val="18"/>
+              </w:rPr>
+              <w:t>Laboratory: {laboratory}</w:t>
+            </w:r>
+          </w:p>
+        </w:tc>
+      </w:tr>
+    </w:tbl>
+    <w:p>
+      <w:pPr>
+        <w:spacing w:after="0" w:line="240" w:lineRule="auto"/>
+        <w:ind w:left="2160" w:hanging="2160"/>
+        <w:rPr>
+          <w:rFonts w:ascii="Cambria" w:eastAsia="Cambria" w:hAnsi="Cambria" w:cs="Cambria"/>
+          <w:sz w:val="2"/>
+          <w:szCs w:val="18"/>
+        </w:rPr>
+      </w:pPr>
+    </w:p>
+    <w:tbl>
+      <w:tblPr>
+        <w:tblW w:w="0" w:type="auto"/>
+        <w:tblInd w:w="-5" w:type="dxa"/>
+        <w:tblBorders>
+          <w:top w:val="single" w:sz="4" w:space="0" w:color="auto"/>
+          <w:left w:val="single" w:sz="4" w:space="0" w:color="auto"/>
+          <w:bottom w:val="single" w:sz="4" w:space="0" w:color="auto"/>
+          <w:right w:val="single" w:sz="4" w:space="0" w:color="auto"/>
+          <w:insideH w:val="single" w:sz="4" w:space="0" w:color="auto"/>
+          <w:insideV w:val="single" w:sz="4" w:space="0" w:color="auto"/>
+        </w:tblBorders>
+        <w:tblLayout w:type="fixed"/>
+        <w:tblLook w:val="0000" w:firstRow="0" w:lastRow="0" w:firstColumn="0" w:lastColumn="0" w:noHBand="0" w:noVBand="0"/>
+      </w:tblPr>
+      <w:tblGrid>
+        <w:gridCol w:w="2710"/>
+        <w:gridCol w:w="2900"/>
+      </w:tblGrid>
+      <w:tr>
+        <w:trPr>
+          <w:trHeight w:val="230"/>
+        </w:trPr>
+        <w:tc>
+          <w:tcPr>
+            <w:tcW w:w="5610" w:type="dxa"/>
+            <w:gridSpan w:val="2"/>
+            <w:tcBorders>
+              <w:top w:val="nil"/>
+              <w:left w:val="nil"/>
+              <w:bottom w:val="nil"/>
+              <w:right w:val="nil"/>
+            </w:tcBorders>
+          </w:tcPr>
+          <w:p>
+            <w:pPr>
+              <w:spacing w:after="0" w:line="240" w:lineRule="auto"/>
+              <w:ind w:left="2160" w:hanging="2160"/>
+              <w:rPr>
+                <w:rFonts w:ascii="Cambria" w:eastAsia="Cambria" w:hAnsi="Cambria" w:cs="Cambria"/>
+                <w:sz w:val="18"/>
+                <w:szCs w:val="18"/>
+              </w:rPr>
+            </w:pPr>
+            <w:r>
+              <w:rPr>
+                <w:rFonts w:ascii="Cambria" w:eastAsia="Cambria" w:hAnsi="Cambria" w:cs="Cambria"/>
+                <w:sz w:val="18"/>
+                <w:szCs w:val="18"/>
+              </w:rPr>
+              <w:t xml:space="preserve">Faculty Name: </w:t>
+            </w:r>
+            <w:r>
+              <w:rPr>
+                <w:rFonts w:ascii="Cambria" w:eastAsia="Cambria" w:hAnsi="Cambria" w:cs="Cambria"/>
+                <w:sz w:val="18"/>
+                <w:szCs w:val="18"/>
+                <w:u w:val="single"/>
+              </w:rPr>
+              <w:t>{</w:t>
+            </w:r>
+            <w:proofErr w:type="spellStart"/>
+            <w:r>
+              <w:rPr>
+                <w:rFonts w:ascii="Cambria" w:eastAsia="Cambria" w:hAnsi="Cambria" w:cs="Cambria"/>
+                <w:sz w:val="18"/>
+                <w:szCs w:val="18"/>
+                <w:u w:val="single"/>
+              </w:rPr>
+              <w:t>faculty_student_name</w:t>
+            </w:r>
+            <w:proofErr w:type="spellEnd"/>
+            <w:r>
+              <w:rPr>
+                <w:rFonts w:ascii="Cambria" w:eastAsia="Cambria" w:hAnsi="Cambria" w:cs="Cambria"/>
+                <w:sz w:val="18"/>
+                <w:szCs w:val="18"/>
+                <w:u w:val="single"/>
+              </w:rPr>
+              <w:t>}</w:t>
+            </w:r>
+            <w:r>
+              <w:rPr>
+                <w:rFonts w:ascii="Cambria" w:eastAsia="Cambria" w:hAnsi="Cambria" w:cs="Cambria"/>
+                <w:sz w:val="18"/>
+                <w:szCs w:val="18"/>
+              </w:rPr>
+              <w:t xml:space="preserve">    </w:t>
+            </w:r>
+          </w:p>
+        </w:tc>
+      </w:tr>
+      <w:tr>
+        <w:tblPrEx>
+          <w:tblBorders>
+            <w:left w:val="none" w:sz="0" w:space="0" w:color="auto"/>
+            <w:bottom w:val="none" w:sz="0" w:space="0" w:color="auto"/>
+            <w:right w:val="none" w:sz="0" w:space="0" w:color="auto"/>
+            <w:insideH w:val="none" w:sz="0" w:space="0" w:color="auto"/>
+            <w:insideV w:val="none" w:sz="0" w:space="0" w:color="auto"/>
+          </w:tblBorders>
+        </w:tblPrEx>
+        <w:trPr>
+          <w:trHeight w:val="100"/>
+        </w:trPr>
+        <w:tc>
+          <w:tcPr>
+            <w:tcW w:w="2710" w:type="dxa"/>
+            <w:tcBorders>
+              <w:top w:val="nil"/>
+              <w:bottom w:val="nil"/>
+            </w:tcBorders>
+          </w:tcPr>
+          <w:p>
+            <w:pPr>
+              <w:spacing w:after="0" w:line="240" w:lineRule="auto"/>
+              <w:rPr>
+                <w:rFonts w:ascii="Cambria" w:eastAsia="Cambria" w:hAnsi="Cambria" w:cs="Cambria"/>
+                <w:sz w:val="18"/>
+                <w:szCs w:val="18"/>
+              </w:rPr>
+            </w:pPr>
+            <w:r>
+              <w:rPr>
+                <w:rFonts w:ascii="Cambria" w:eastAsia="Cambria" w:hAnsi="Cambria" w:cs="Cambria"/>
+                <w:sz w:val="18"/>
+                <w:szCs w:val="18"/>
+              </w:rPr>
+              <w:t xml:space="preserve">Release Time: </w:t>
+            </w:r>
+            <w:r>
+              <w:rPr>
+                <w:rFonts w:ascii="Cambria" w:eastAsia="Cambria" w:hAnsi="Cambria" w:cs="Cambria"/>
+                <w:sz w:val="18"/>
+                <w:szCs w:val="18"/>
+                <w:u w:val="single"/>
+              </w:rPr>
+              <w:t>{</w:t>
+            </w:r>
+            <w:proofErr w:type="spellStart"/>
+            <w:r>
+              <w:rPr>
+                <w:rFonts w:ascii="Cambria" w:eastAsia="Cambria" w:hAnsi="Cambria" w:cs="Cambria"/>
+                <w:sz w:val="18"/>
+                <w:szCs w:val="18"/>
+                <w:u w:val="single"/>
+              </w:rPr>
+              <w:t>release_time</w:t>
+            </w:r>
+            <w:proofErr w:type="spellEnd"/>
+            <w:r>
+              <w:rPr>
+                <w:rFonts w:ascii="Cambria" w:eastAsia="Cambria" w:hAnsi="Cambria" w:cs="Cambria"/>
+                <w:sz w:val="18"/>
+                <w:szCs w:val="18"/>
+                <w:u w:val="single"/>
+              </w:rPr>
+              <w:t>}</w:t>
+            </w:r>
+          </w:p>
+        </w:tc>
+        <w:tc>
+          <w:tcPr>
+            <w:tcW w:w="2900" w:type="dxa"/>
+            <w:tcBorders>
+              <w:top w:val="nil"/>
+              <w:bottom w:val="nil"/>
+              <w:right w:val="nil"/>
+            </w:tcBorders>
+            <w:shd w:val="clear" w:color="auto" w:fill="auto"/>
+          </w:tcPr>
+          <w:p>
+            <w:pPr>
+              <w:spacing w:after="0" w:line="240" w:lineRule="auto"/>
+              <w:rPr>
+                <w:rFonts w:ascii="Cambria" w:eastAsia="Cambria" w:hAnsi="Cambria" w:cs="Cambria"/>
+                <w:sz w:val="18"/>
+                <w:szCs w:val="18"/>
+              </w:rPr>
+            </w:pPr>
+            <w:r>
+              <w:rPr>
+                <w:rFonts w:ascii="Cambria" w:eastAsia="Cambria" w:hAnsi="Cambria" w:cs="Cambria"/>
+                <w:sz w:val="18"/>
+                <w:szCs w:val="18"/>
+              </w:rPr>
+              <w:t xml:space="preserve">Returned Time: </w:t>
+            </w:r>
+            <w:r>
+              <w:rPr>
+                <w:rFonts w:ascii="Cambria" w:eastAsia="Cambria" w:hAnsi="Cambria" w:cs="Cambria"/>
+                <w:sz w:val="18"/>
+                <w:szCs w:val="18"/>
+                <w:u w:val="single"/>
+              </w:rPr>
+              <w:t>{</w:t>
+            </w:r>
+            <w:proofErr w:type="spellStart"/>
+            <w:r>
+              <w:rPr>
+                <w:rFonts w:ascii="Cambria" w:eastAsia="Cambria" w:hAnsi="Cambria" w:cs="Cambria"/>
+                <w:sz w:val="18"/>
+                <w:szCs w:val="18"/>
+                <w:u w:val="single"/>
+              </w:rPr>
+              <w:t>returned_time</w:t>
+            </w:r>
+            <w:proofErr w:type="spellEnd"/>
+            <w:r>
+              <w:rPr>
+                <w:rFonts w:ascii="Cambria" w:eastAsia="Cambria" w:hAnsi="Cambria" w:cs="Cambria"/>
+                <w:sz w:val="18"/>
+                <w:szCs w:val="18"/>
+                <w:u w:val="single"/>
+              </w:rPr>
+              <w:t>}</w:t>
+            </w:r>
+          </w:p>
+        </w:tc>
+      </w:tr>
+    </w:tbl>
+    <w:p>
+      <w:pPr>
+        <w:spacing w:after="0" w:line="240" w:lineRule="auto"/>
+        <w:rPr>
+          <w:rFonts w:ascii="Cambria" w:eastAsia="Cambria" w:hAnsi="Cambria" w:cs="Cambria"/>
+          <w:sz w:val="10"/>
+          <w:szCs w:val="18"/>
+          <w:u w:val="single"/>
+        </w:rPr>
+      </w:pPr>
+    </w:p>
+    <w:p>
+      <w:pPr>
+        <w:spacing w:after="0" w:line="240" w:lineRule="auto"/>
+        <w:ind w:left="720" w:hanging="720"/>
+        <w:rPr>
+          <w:rFonts w:ascii="Cambria" w:eastAsia="Cambria" w:hAnsi="Cambria" w:cs="Cambria"/>
           <w:sz w:val="18"/>
           <w:szCs w:val="18"/>
         </w:rPr>
       </w:pPr>
       <w:r>
         <w:rPr>
-          <w:rFonts w:eastAsia="Cambria" w:cs="Cambria" w:ascii="Cambria" w:hAnsi="Cambria"/>
-          <w:b/>
-          <w:sz w:val="18"/>
-          <w:szCs w:val="18"/>
-        </w:rPr>
-      </w:r>
-    </w:p>
-    <w:p>
-      <w:pPr>
-        <w:pStyle w:val="Normal"/>
-        <w:spacing w:lineRule="auto" w:line="240" w:before="0" w:after="0"/>
-        <w:rPr>
-          <w:rFonts w:ascii="Cambria" w:hAnsi="Cambria" w:eastAsia="Cambria" w:cs="Cambria"/>
-          <w:sz w:val="18"/>
-          <w:szCs w:val="18"/>
-        </w:rPr>
-      </w:pPr>
-      <w:r>
-        <w:rPr>
-          <w:rFonts w:eastAsia="Cambria" w:cs="Cambria" w:ascii="Cambria" w:hAnsi="Cambria"/>
-          <w:sz w:val="18"/>
-          <w:szCs w:val="18"/>
-        </w:rPr>
-        <w:t xml:space="preserve">Date: {date}        </w:t>
-        <w:tab/>
-        <w:t xml:space="preserve">      Laboratory: {laboratory} </w:t>
-      </w:r>
-    </w:p>
-    <w:p>
-      <w:pPr>
-        <w:pStyle w:val="Normal"/>
-        <w:spacing w:lineRule="auto" w:line="240" w:before="0" w:after="0"/>
-        <w:rPr>
-          <w:rFonts w:ascii="Cambria" w:hAnsi="Cambria" w:eastAsia="Cambria" w:cs="Cambria"/>
-          <w:sz w:val="18"/>
-          <w:szCs w:val="18"/>
-          <w:u w:val="single"/>
-        </w:rPr>
-      </w:pPr>
-      <w:r>
-        <w:rPr>
-          <w:rFonts w:eastAsia="Cambria" w:cs="Cambria" w:ascii="Cambria" w:hAnsi="Cambria"/>
-          <w:sz w:val="18"/>
-          <w:szCs w:val="18"/>
-        </w:rPr>
-        <w:t xml:space="preserve">Faculty Name: </w:t>
-      </w:r>
-      <w:r>
-        <w:rPr>
-          <w:rFonts w:eastAsia="Cambria" w:cs="Cambria" w:ascii="Cambria" w:hAnsi="Cambria"/>
-          <w:sz w:val="18"/>
-          <w:szCs w:val="18"/>
-          <w:u w:val="single"/>
-        </w:rPr>
-        <w:t>{faculty_student_name}</w:t>
-      </w:r>
-      <w:r>
-        <w:rPr>
-          <w:rFonts w:eastAsia="Cambria" w:cs="Cambria" w:ascii="Cambria" w:hAnsi="Cambria"/>
-          <w:sz w:val="18"/>
-          <w:szCs w:val="18"/>
-        </w:rPr>
-        <w:t xml:space="preserve">    </w:t>
-      </w:r>
-    </w:p>
-    <w:p>
-      <w:pPr>
-        <w:pStyle w:val="Normal"/>
-        <w:spacing w:lineRule="auto" w:line="240" w:before="0" w:after="0"/>
-        <w:rPr>
-          <w:rFonts w:ascii="Cambria" w:hAnsi="Cambria" w:eastAsia="Cambria" w:cs="Cambria"/>
-          <w:sz w:val="18"/>
-          <w:szCs w:val="18"/>
-          <w:u w:val="single"/>
-        </w:rPr>
-      </w:pPr>
-      <w:r>
-        <w:rPr>
-          <w:rFonts w:eastAsia="Cambria" w:cs="Cambria" w:ascii="Cambria" w:hAnsi="Cambria"/>
-          <w:sz w:val="18"/>
-          <w:szCs w:val="18"/>
-        </w:rPr>
-        <w:t xml:space="preserve">Release Time: </w:t>
-      </w:r>
-      <w:r>
-        <w:rPr>
-          <w:rFonts w:eastAsia="Cambria" w:cs="Cambria" w:ascii="Cambria" w:hAnsi="Cambria"/>
-          <w:sz w:val="18"/>
-          <w:szCs w:val="18"/>
-          <w:u w:val="single"/>
-        </w:rPr>
-        <w:t>{release_time}</w:t>
-      </w:r>
-      <w:r>
-        <w:rPr>
-          <w:rFonts w:eastAsia="Cambria" w:cs="Cambria" w:ascii="Cambria" w:hAnsi="Cambria"/>
-          <w:sz w:val="18"/>
-          <w:szCs w:val="18"/>
-        </w:rPr>
-        <w:tab/>
-        <w:t xml:space="preserve">Returned Time: </w:t>
-      </w:r>
-      <w:r>
-        <w:rPr>
-          <w:rFonts w:eastAsia="Cambria" w:cs="Cambria" w:ascii="Cambria" w:hAnsi="Cambria"/>
-          <w:sz w:val="18"/>
-          <w:szCs w:val="18"/>
-          <w:u w:val="single"/>
-        </w:rPr>
-        <w:t>{returned_time}</w:t>
-      </w:r>
-    </w:p>
-    <w:p>
-      <w:pPr>
-        <w:pStyle w:val="Normal"/>
-        <w:spacing w:lineRule="auto" w:line="240" w:before="0" w:after="0"/>
-        <w:rPr>
-          <w:rFonts w:ascii="Cambria" w:hAnsi="Cambria" w:eastAsia="Cambria" w:cs="Cambria"/>
-          <w:sz w:val="18"/>
-          <w:szCs w:val="18"/>
-        </w:rPr>
-      </w:pPr>
-      <w:r>
-        <w:rPr>
-          <w:rFonts w:eastAsia="Cambria" w:cs="Cambria" w:ascii="Cambria" w:hAnsi="Cambria"/>
+          <w:rFonts w:ascii="Cambria" w:eastAsia="Cambria" w:hAnsi="Cambria" w:cs="Cambria"/>
           <w:sz w:val="18"/>
           <w:szCs w:val="18"/>
         </w:rPr>
@@ -191,81 +402,88 @@
     </w:p>
     <w:tbl>
       <w:tblPr>
-        <w:tblStyle w:val="a"/>
         <w:tblW w:w="5657" w:type="dxa"/>
-        <w:jc w:val="start"/>
-        <w:tblInd w:w="0" w:type="dxa"/>
         <w:tblLayout w:type="fixed"/>
-        <w:tblCellMar>
-          <w:top w:w="0" w:type="dxa"/>
-          <w:start w:w="108" w:type="dxa"/>
-          <w:bottom w:w="0" w:type="dxa"/>
-          <w:end w:w="108" w:type="dxa"/>
-        </w:tblCellMar>
-        <w:tblLook w:firstRow="0" w:noVBand="1" w:lastRow="0" w:firstColumn="0" w:lastColumn="0" w:noHBand="0" w:val="0400"/>
+        <w:tblLook w:val="0400" w:firstRow="0" w:lastRow="0" w:firstColumn="0" w:lastColumn="0" w:noHBand="0" w:noVBand="1"/>
       </w:tblPr>
       <w:tblGrid>
         <w:gridCol w:w="984"/>
-        <w:gridCol w:w="4672"/>
+        <w:gridCol w:w="4673"/>
       </w:tblGrid>
       <w:tr>
         <w:trPr>
-          <w:trHeight w:val="288" w:hRule="atLeast"/>
+          <w:trHeight w:val="288"/>
         </w:trPr>
         <w:tc>
           <w:tcPr>
             <w:tcW w:w="984" w:type="dxa"/>
             <w:tcBorders>
               <w:top w:val="single" w:sz="4" w:space="0" w:color="000000"/>
-              <w:start w:val="single" w:sz="4" w:space="0" w:color="000000"/>
+              <w:left w:val="single" w:sz="4" w:space="0" w:color="000000"/>
               <w:bottom w:val="single" w:sz="4" w:space="0" w:color="000000"/>
-              <w:end w:val="single" w:sz="4" w:space="0" w:color="000000"/>
+              <w:right w:val="single" w:sz="4" w:space="0" w:color="000000"/>
             </w:tcBorders>
           </w:tcPr>
           <w:p>
             <w:pPr>
-              <w:pStyle w:val="Normal"/>
-              <w:spacing w:lineRule="auto" w:line="240" w:before="0" w:after="0"/>
-              <w:rPr>
-                <w:rFonts w:ascii="Cambria" w:hAnsi="Cambria" w:eastAsia="Cambria" w:cs="Cambria"/>
+              <w:spacing w:after="0" w:line="240" w:lineRule="auto"/>
+              <w:rPr>
+                <w:rFonts w:ascii="Cambria" w:eastAsia="Cambria" w:hAnsi="Cambria" w:cs="Cambria"/>
                 <w:sz w:val="18"/>
                 <w:szCs w:val="18"/>
               </w:rPr>
             </w:pPr>
             <w:r>
               <w:rPr>
-                <w:rFonts w:eastAsia="Cambria" w:cs="Cambria" w:ascii="Cambria" w:hAnsi="Cambria"/>
-                <w:sz w:val="18"/>
-                <w:szCs w:val="18"/>
-              </w:rPr>
-              <w:t>Unit/Oty.</w:t>
+                <w:rFonts w:ascii="Cambria" w:eastAsia="Cambria" w:hAnsi="Cambria" w:cs="Cambria"/>
+                <w:sz w:val="18"/>
+                <w:szCs w:val="18"/>
+              </w:rPr>
+              <w:t>Unit/</w:t>
+            </w:r>
+            <w:proofErr w:type="spellStart"/>
+            <w:r>
+              <w:rPr>
+                <w:rFonts w:ascii="Cambria" w:eastAsia="Cambria" w:hAnsi="Cambria" w:cs="Cambria"/>
+                <w:sz w:val="18"/>
+                <w:szCs w:val="18"/>
+              </w:rPr>
+              <w:t>Oty</w:t>
+            </w:r>
+            <w:proofErr w:type="spellEnd"/>
+            <w:r>
+              <w:rPr>
+                <w:rFonts w:ascii="Cambria" w:eastAsia="Cambria" w:hAnsi="Cambria" w:cs="Cambria"/>
+                <w:sz w:val="18"/>
+                <w:szCs w:val="18"/>
+              </w:rPr>
+              <w:t>.</w:t>
             </w:r>
           </w:p>
         </w:tc>
         <w:tc>
           <w:tcPr>
-            <w:tcW w:w="4672" w:type="dxa"/>
+            <w:tcW w:w="4673" w:type="dxa"/>
             <w:tcBorders>
               <w:top w:val="single" w:sz="4" w:space="0" w:color="000000"/>
-              <w:start w:val="single" w:sz="4" w:space="0" w:color="000000"/>
+              <w:left w:val="single" w:sz="4" w:space="0" w:color="000000"/>
               <w:bottom w:val="single" w:sz="4" w:space="0" w:color="000000"/>
-              <w:end w:val="single" w:sz="4" w:space="0" w:color="000000"/>
+              <w:right w:val="single" w:sz="4" w:space="0" w:color="000000"/>
             </w:tcBorders>
           </w:tcPr>
           <w:p>
             <w:pPr>
-              <w:pStyle w:val="Normal"/>
-              <w:spacing w:lineRule="auto" w:line="240" w:before="0" w:after="0"/>
+              <w:spacing w:after="0" w:line="240" w:lineRule="auto"/>
               <w:jc w:val="center"/>
               <w:rPr>
-                <w:rFonts w:ascii="Cambria" w:hAnsi="Cambria" w:eastAsia="Cambria" w:cs="Cambria"/>
+                <w:rFonts w:ascii="Cambria" w:eastAsia="Cambria" w:hAnsi="Cambria" w:cs="Cambria"/>
                 <w:sz w:val="18"/>
                 <w:szCs w:val="18"/>
               </w:rPr>
             </w:pPr>
             <w:r>
               <w:rPr>
-                <w:rFonts w:eastAsia="Cambria" w:cs="Cambria" w:ascii="Cambria" w:hAnsi="Cambria"/>
+                <w:rFonts w:ascii="Cambria" w:eastAsia="Cambria" w:hAnsi="Cambria" w:cs="Cambria"/>
                 <w:sz w:val="18"/>
                 <w:szCs w:val="18"/>
               </w:rPr>
@@ -276,67 +494,101 @@
       </w:tr>
       <w:tr>
         <w:trPr>
-          <w:trHeight w:val="288" w:hRule="atLeast"/>
+          <w:trHeight w:val="233"/>
         </w:trPr>
         <w:tc>
           <w:tcPr>
             <w:tcW w:w="984" w:type="dxa"/>
             <w:tcBorders>
               <w:top w:val="single" w:sz="4" w:space="0" w:color="000000"/>
-              <w:start w:val="single" w:sz="4" w:space="0" w:color="000000"/>
+              <w:left w:val="single" w:sz="4" w:space="0" w:color="000000"/>
               <w:bottom w:val="single" w:sz="4" w:space="0" w:color="000000"/>
-              <w:end w:val="single" w:sz="4" w:space="0" w:color="000000"/>
+              <w:right w:val="single" w:sz="4" w:space="0" w:color="000000"/>
             </w:tcBorders>
           </w:tcPr>
           <w:p>
             <w:pPr>
-              <w:pStyle w:val="Normal"/>
-              <w:spacing w:lineRule="auto" w:line="240" w:before="0" w:after="0"/>
+              <w:spacing w:after="0" w:line="240" w:lineRule="auto"/>
               <w:jc w:val="center"/>
               <w:rPr>
-                <w:rFonts w:ascii="Cambria" w:hAnsi="Cambria" w:eastAsia="Cambria" w:cs="Cambria"/>
+                <w:rFonts w:ascii="Cambria" w:eastAsia="Cambria" w:hAnsi="Cambria" w:cs="Cambria"/>
                 <w:sz w:val="18"/>
                 <w:szCs w:val="18"/>
               </w:rPr>
             </w:pPr>
             <w:r>
               <w:rPr>
-                <w:rFonts w:eastAsia="Cambria" w:cs="Cambria" w:ascii="Cambria" w:hAnsi="Cambria"/>
-                <w:sz w:val="18"/>
-                <w:szCs w:val="18"/>
-              </w:rPr>
-              <w:t>{unitQty_column}</w:t>
+                <w:rFonts w:ascii="Cambria" w:eastAsia="Cambria" w:hAnsi="Cambria" w:cs="Cambria"/>
+                <w:sz w:val="18"/>
+                <w:szCs w:val="18"/>
+              </w:rPr>
+              <w:t>{</w:t>
+            </w:r>
+            <w:proofErr w:type="spellStart"/>
+            <w:r>
+              <w:rPr>
+                <w:rFonts w:ascii="Cambria" w:eastAsia="Cambria" w:hAnsi="Cambria" w:cs="Cambria"/>
+                <w:sz w:val="18"/>
+                <w:szCs w:val="18"/>
+              </w:rPr>
+              <w:t>unitQty_column</w:t>
+            </w:r>
+            <w:proofErr w:type="spellEnd"/>
+            <w:r>
+              <w:rPr>
+                <w:rFonts w:ascii="Cambria" w:eastAsia="Cambria" w:hAnsi="Cambria" w:cs="Cambria"/>
+                <w:sz w:val="18"/>
+                <w:szCs w:val="18"/>
+              </w:rPr>
+              <w:t>}</w:t>
             </w:r>
           </w:p>
         </w:tc>
         <w:tc>
           <w:tcPr>
-            <w:tcW w:w="4672" w:type="dxa"/>
+            <w:tcW w:w="4673" w:type="dxa"/>
             <w:tcBorders>
               <w:top w:val="single" w:sz="4" w:space="0" w:color="000000"/>
-              <w:start w:val="single" w:sz="4" w:space="0" w:color="000000"/>
+              <w:left w:val="single" w:sz="4" w:space="0" w:color="000000"/>
               <w:bottom w:val="single" w:sz="4" w:space="0" w:color="000000"/>
-              <w:end w:val="single" w:sz="4" w:space="0" w:color="000000"/>
+              <w:right w:val="single" w:sz="4" w:space="0" w:color="000000"/>
             </w:tcBorders>
           </w:tcPr>
           <w:p>
             <w:pPr>
-              <w:pStyle w:val="Normal"/>
-              <w:spacing w:lineRule="auto" w:line="240" w:before="0" w:after="0"/>
+              <w:spacing w:after="0" w:line="240" w:lineRule="auto"/>
               <w:jc w:val="center"/>
               <w:rPr>
-                <w:rFonts w:ascii="Cambria" w:hAnsi="Cambria" w:eastAsia="Cambria" w:cs="Cambria"/>
+                <w:rFonts w:ascii="Cambria" w:eastAsia="Cambria" w:hAnsi="Cambria" w:cs="Cambria"/>
                 <w:sz w:val="18"/>
                 <w:szCs w:val="18"/>
               </w:rPr>
             </w:pPr>
             <w:r>
               <w:rPr>
-                <w:rFonts w:eastAsia="Cambria" w:cs="Cambria" w:ascii="Cambria" w:hAnsi="Cambria"/>
-                <w:sz w:val="18"/>
-                <w:szCs w:val="18"/>
-              </w:rPr>
-              <w:t>{equipmentName_column}</w:t>
+                <w:rFonts w:ascii="Cambria" w:eastAsia="Cambria" w:hAnsi="Cambria" w:cs="Cambria"/>
+                <w:sz w:val="18"/>
+                <w:szCs w:val="18"/>
+              </w:rPr>
+              <w:t>{</w:t>
+            </w:r>
+            <w:proofErr w:type="spellStart"/>
+            <w:r>
+              <w:rPr>
+                <w:rFonts w:ascii="Cambria" w:eastAsia="Cambria" w:hAnsi="Cambria" w:cs="Cambria"/>
+                <w:sz w:val="18"/>
+                <w:szCs w:val="18"/>
+              </w:rPr>
+              <w:t>equipmentName_column</w:t>
+            </w:r>
+            <w:proofErr w:type="spellEnd"/>
+            <w:r>
+              <w:rPr>
+                <w:rFonts w:ascii="Cambria" w:eastAsia="Cambria" w:hAnsi="Cambria" w:cs="Cambria"/>
+                <w:sz w:val="18"/>
+                <w:szCs w:val="18"/>
+              </w:rPr>
+              <w:t>}</w:t>
             </w:r>
           </w:p>
         </w:tc>
@@ -344,398 +596,646 @@
     </w:tbl>
     <w:p>
       <w:pPr>
-        <w:pStyle w:val="Normal"/>
-        <w:spacing w:lineRule="auto" w:line="360" w:before="0" w:after="0"/>
+        <w:spacing w:after="0" w:line="240" w:lineRule="auto"/>
         <w:rPr>
-          <w:rFonts w:ascii="Cambria" w:hAnsi="Cambria" w:eastAsia="Cambria" w:cs="Cambria"/>
-          <w:sz w:val="18"/>
+          <w:rFonts w:ascii="Cambria" w:eastAsia="Cambria" w:hAnsi="Cambria" w:cs="Cambria"/>
+          <w:sz w:val="10"/>
           <w:szCs w:val="18"/>
         </w:rPr>
       </w:pPr>
-      <w:r>
-        <w:rPr>
-          <w:rFonts w:eastAsia="Cambria" w:cs="Cambria" w:ascii="Cambria" w:hAnsi="Cambria"/>
-          <w:sz w:val="18"/>
-          <w:szCs w:val="18"/>
-        </w:rPr>
-        <w:t xml:space="preserve">Purpose: </w:t>
-      </w:r>
-      <w:r>
-        <w:rPr>
-          <w:rFonts w:eastAsia="Cambria" w:cs="Cambria" w:ascii="Cambria" w:hAnsi="Cambria"/>
-          <w:sz w:val="18"/>
-          <w:szCs w:val="18"/>
-          <w:u w:val="single"/>
-        </w:rPr>
-        <w:t>{purpose}</w:t>
-      </w:r>
     </w:p>
+    <w:tbl>
+      <w:tblPr>
+        <w:tblStyle w:val="TableGrid"/>
+        <w:tblW w:w="0" w:type="auto"/>
+        <w:tblBorders>
+          <w:top w:val="none" w:sz="0" w:space="0" w:color="auto"/>
+          <w:left w:val="none" w:sz="0" w:space="0" w:color="auto"/>
+          <w:bottom w:val="none" w:sz="0" w:space="0" w:color="auto"/>
+          <w:right w:val="none" w:sz="0" w:space="0" w:color="auto"/>
+          <w:insideH w:val="none" w:sz="0" w:space="0" w:color="auto"/>
+          <w:insideV w:val="none" w:sz="0" w:space="0" w:color="auto"/>
+        </w:tblBorders>
+        <w:tblLayout w:type="fixed"/>
+        <w:tblLook w:val="0000" w:firstRow="0" w:lastRow="0" w:firstColumn="0" w:lastColumn="0" w:noHBand="0" w:noVBand="0"/>
+      </w:tblPr>
+      <w:tblGrid>
+        <w:gridCol w:w="2694"/>
+        <w:gridCol w:w="2901"/>
+      </w:tblGrid>
+      <w:tr>
+        <w:trPr>
+          <w:trHeight w:val="188"/>
+        </w:trPr>
+        <w:tc>
+          <w:tcPr>
+            <w:tcW w:w="5595" w:type="dxa"/>
+            <w:gridSpan w:val="2"/>
+          </w:tcPr>
+          <w:p>
+            <w:pPr>
+              <w:spacing w:after="0" w:line="360" w:lineRule="auto"/>
+              <w:rPr>
+                <w:rFonts w:ascii="Cambria" w:eastAsia="Cambria" w:hAnsi="Cambria" w:cs="Cambria"/>
+                <w:sz w:val="20"/>
+                <w:szCs w:val="18"/>
+              </w:rPr>
+            </w:pPr>
+            <w:r>
+              <w:rPr>
+                <w:rFonts w:ascii="Cambria" w:eastAsia="Cambria" w:hAnsi="Cambria" w:cs="Cambria"/>
+                <w:sz w:val="18"/>
+                <w:szCs w:val="18"/>
+              </w:rPr>
+              <w:t xml:space="preserve">Purpose: </w:t>
+            </w:r>
+            <w:r>
+              <w:rPr>
+                <w:rFonts w:ascii="Cambria" w:eastAsia="Cambria" w:hAnsi="Cambria" w:cs="Cambria"/>
+                <w:sz w:val="18"/>
+                <w:szCs w:val="18"/>
+                <w:u w:val="single"/>
+              </w:rPr>
+              <w:t>{purpose}</w:t>
+            </w:r>
+          </w:p>
+        </w:tc>
+      </w:tr>
+      <w:tr>
+        <w:trPr>
+          <w:trHeight w:val="149"/>
+        </w:trPr>
+        <w:tc>
+          <w:tcPr>
+            <w:tcW w:w="2694" w:type="dxa"/>
+          </w:tcPr>
+          <w:p>
+            <w:pPr>
+              <w:spacing w:after="0" w:line="360" w:lineRule="auto"/>
+              <w:rPr>
+                <w:rFonts w:ascii="Cambria" w:eastAsia="Cambria" w:hAnsi="Cambria" w:cs="Cambria"/>
+                <w:sz w:val="18"/>
+                <w:szCs w:val="18"/>
+              </w:rPr>
+            </w:pPr>
+            <w:r>
+              <w:rPr>
+                <w:rFonts w:ascii="Cambria" w:eastAsia="Cambria" w:hAnsi="Cambria" w:cs="Cambria"/>
+                <w:sz w:val="18"/>
+                <w:szCs w:val="18"/>
+              </w:rPr>
+              <w:t>Requested by:</w:t>
+            </w:r>
+            <w:r>
+              <w:rPr>
+                <w:rFonts w:ascii="Cambria" w:eastAsia="Cambria" w:hAnsi="Cambria" w:cs="Cambria"/>
+                <w:sz w:val="18"/>
+                <w:szCs w:val="18"/>
+              </w:rPr>
+              <w:tab/>
+            </w:r>
+          </w:p>
+        </w:tc>
+        <w:tc>
+          <w:tcPr>
+            <w:tcW w:w="2901" w:type="dxa"/>
+          </w:tcPr>
+          <w:p>
+            <w:pPr>
+              <w:spacing w:after="0" w:line="240" w:lineRule="auto"/>
+              <w:rPr>
+                <w:rFonts w:ascii="Cambria" w:eastAsia="Cambria" w:hAnsi="Cambria" w:cs="Cambria"/>
+                <w:sz w:val="18"/>
+                <w:szCs w:val="18"/>
+              </w:rPr>
+            </w:pPr>
+            <w:r>
+              <w:rPr>
+                <w:rFonts w:ascii="Cambria" w:eastAsia="Cambria" w:hAnsi="Cambria" w:cs="Cambria"/>
+                <w:sz w:val="18"/>
+                <w:szCs w:val="18"/>
+              </w:rPr>
+              <w:t>Approved by:</w:t>
+            </w:r>
+          </w:p>
+        </w:tc>
+      </w:tr>
+      <w:tr>
+        <w:trPr>
+          <w:trHeight w:val="254"/>
+        </w:trPr>
+        <w:tc>
+          <w:tcPr>
+            <w:tcW w:w="2694" w:type="dxa"/>
+          </w:tcPr>
+          <w:p>
+            <w:pPr>
+              <w:spacing w:after="0" w:line="360" w:lineRule="auto"/>
+              <w:jc w:val="center"/>
+              <w:rPr>
+                <w:rFonts w:ascii="Cambria" w:eastAsia="Cambria" w:hAnsi="Cambria" w:cs="Cambria"/>
+                <w:sz w:val="18"/>
+                <w:szCs w:val="16"/>
+                <w:u w:val="single"/>
+              </w:rPr>
+            </w:pPr>
+            <w:r>
+              <w:rPr>
+                <w:rFonts w:ascii="Cambria" w:eastAsia="Cambria" w:hAnsi="Cambria" w:cs="Cambria"/>
+                <w:sz w:val="18"/>
+                <w:szCs w:val="18"/>
+                <w:u w:val="single"/>
+              </w:rPr>
+              <w:t>{</w:t>
+            </w:r>
+            <w:proofErr w:type="spellStart"/>
+            <w:r>
+              <w:rPr>
+                <w:rFonts w:ascii="Cambria" w:eastAsia="Cambria" w:hAnsi="Cambria" w:cs="Cambria"/>
+                <w:sz w:val="18"/>
+                <w:szCs w:val="18"/>
+                <w:u w:val="single"/>
+              </w:rPr>
+              <w:t>requested_by</w:t>
+            </w:r>
+            <w:proofErr w:type="spellEnd"/>
+            <w:r>
+              <w:rPr>
+                <w:rFonts w:ascii="Cambria" w:eastAsia="Cambria" w:hAnsi="Cambria" w:cs="Cambria"/>
+                <w:sz w:val="18"/>
+                <w:szCs w:val="18"/>
+                <w:u w:val="single"/>
+              </w:rPr>
+              <w:t>}</w:t>
+            </w:r>
+          </w:p>
+        </w:tc>
+        <w:tc>
+          <w:tcPr>
+            <w:tcW w:w="2901" w:type="dxa"/>
+          </w:tcPr>
+          <w:p>
+            <w:pPr>
+              <w:spacing w:after="0" w:line="360" w:lineRule="auto"/>
+              <w:jc w:val="center"/>
+              <w:rPr>
+                <w:rFonts w:ascii="Cambria" w:eastAsia="Cambria" w:hAnsi="Cambria" w:cs="Cambria"/>
+                <w:sz w:val="18"/>
+                <w:szCs w:val="18"/>
+              </w:rPr>
+            </w:pPr>
+            <w:r>
+              <w:rPr>
+                <w:rFonts w:ascii="Cambria" w:eastAsia="Cambria" w:hAnsi="Cambria" w:cs="Cambria"/>
+                <w:sz w:val="18"/>
+                <w:szCs w:val="16"/>
+                <w:u w:val="single"/>
+              </w:rPr>
+              <w:t>{</w:t>
+            </w:r>
+            <w:proofErr w:type="spellStart"/>
+            <w:r>
+              <w:rPr>
+                <w:rFonts w:ascii="Cambria" w:eastAsia="Cambria" w:hAnsi="Cambria" w:cs="Cambria"/>
+                <w:sz w:val="18"/>
+                <w:szCs w:val="16"/>
+                <w:u w:val="single"/>
+              </w:rPr>
+              <w:t>approved_by</w:t>
+            </w:r>
+            <w:proofErr w:type="spellEnd"/>
+            <w:r>
+              <w:rPr>
+                <w:rFonts w:ascii="Cambria" w:eastAsia="Cambria" w:hAnsi="Cambria" w:cs="Cambria"/>
+                <w:sz w:val="18"/>
+                <w:szCs w:val="16"/>
+                <w:u w:val="single"/>
+              </w:rPr>
+              <w:t>}</w:t>
+            </w:r>
+          </w:p>
+        </w:tc>
+      </w:tr>
+      <w:tr>
+        <w:trPr>
+          <w:trHeight w:val="201"/>
+        </w:trPr>
+        <w:tc>
+          <w:tcPr>
+            <w:tcW w:w="2694" w:type="dxa"/>
+          </w:tcPr>
+          <w:p>
+            <w:pPr>
+              <w:spacing w:after="0" w:line="360" w:lineRule="auto"/>
+              <w:jc w:val="center"/>
+              <w:rPr>
+                <w:rFonts w:ascii="Cambria" w:eastAsia="Cambria" w:hAnsi="Cambria" w:cs="Cambria"/>
+                <w:sz w:val="18"/>
+                <w:szCs w:val="18"/>
+              </w:rPr>
+            </w:pPr>
+            <w:r>
+              <w:rPr>
+                <w:rFonts w:ascii="Cambria" w:eastAsia="Cambria" w:hAnsi="Cambria" w:cs="Cambria"/>
+                <w:sz w:val="18"/>
+                <w:szCs w:val="18"/>
+              </w:rPr>
+              <w:t>Faculty Signature</w:t>
+            </w:r>
+            <w:r>
+              <w:rPr>
+                <w:rFonts w:ascii="Cambria" w:eastAsia="Cambria" w:hAnsi="Cambria" w:cs="Cambria"/>
+                <w:sz w:val="18"/>
+                <w:szCs w:val="18"/>
+              </w:rPr>
+              <w:tab/>
+            </w:r>
+          </w:p>
+        </w:tc>
+        <w:tc>
+          <w:tcPr>
+            <w:tcW w:w="2901" w:type="dxa"/>
+          </w:tcPr>
+          <w:p>
+            <w:pPr>
+              <w:spacing w:after="0" w:line="360" w:lineRule="auto"/>
+              <w:jc w:val="center"/>
+              <w:rPr>
+                <w:rFonts w:ascii="Cambria" w:eastAsia="Cambria" w:hAnsi="Cambria" w:cs="Cambria"/>
+                <w:sz w:val="18"/>
+                <w:szCs w:val="18"/>
+              </w:rPr>
+            </w:pPr>
+            <w:r>
+              <w:rPr>
+                <w:rFonts w:ascii="Cambria" w:eastAsia="Cambria" w:hAnsi="Cambria" w:cs="Cambria"/>
+                <w:sz w:val="18"/>
+                <w:szCs w:val="18"/>
+              </w:rPr>
+              <w:t>Dean</w:t>
+            </w:r>
+          </w:p>
+        </w:tc>
+      </w:tr>
+      <w:tr>
+        <w:trPr>
+          <w:trHeight w:val="164"/>
+        </w:trPr>
+        <w:tc>
+          <w:tcPr>
+            <w:tcW w:w="5595" w:type="dxa"/>
+            <w:gridSpan w:val="2"/>
+          </w:tcPr>
+          <w:p>
+            <w:pPr>
+              <w:tabs>
+                <w:tab w:val="left" w:pos="2260"/>
+              </w:tabs>
+              <w:spacing w:after="0"/>
+              <w:rPr>
+                <w:rFonts w:ascii="Cambria" w:eastAsia="Cambria" w:hAnsi="Cambria" w:cs="Cambria"/>
+                <w:sz w:val="18"/>
+                <w:szCs w:val="16"/>
+                <w:u w:val="single"/>
+              </w:rPr>
+            </w:pPr>
+            <w:r>
+              <w:rPr>
+                <w:rFonts w:ascii="Cambria" w:eastAsia="Cambria" w:hAnsi="Cambria" w:cs="Cambria"/>
+                <w:sz w:val="18"/>
+                <w:szCs w:val="18"/>
+              </w:rPr>
+              <w:t>---------------------------------------------------------------------------------</w:t>
+            </w:r>
+            <w:r>
+              <w:rPr>
+                <w:rFonts w:ascii="Cambria" w:eastAsia="Cambria" w:hAnsi="Cambria" w:cs="Cambria"/>
+                <w:sz w:val="18"/>
+                <w:szCs w:val="18"/>
+              </w:rPr>
+              <w:t>---------</w:t>
+            </w:r>
+          </w:p>
+        </w:tc>
+      </w:tr>
+      <w:tr>
+        <w:trPr>
+          <w:trHeight w:val="100"/>
+        </w:trPr>
+        <w:tc>
+          <w:tcPr>
+            <w:tcW w:w="5595" w:type="dxa"/>
+            <w:gridSpan w:val="2"/>
+          </w:tcPr>
+          <w:p>
+            <w:pPr>
+              <w:spacing w:after="0"/>
+              <w:jc w:val="center"/>
+              <w:rPr>
+                <w:rFonts w:ascii="Cambria" w:eastAsia="Cambria" w:hAnsi="Cambria" w:cs="Cambria"/>
+                <w:b/>
+                <w:sz w:val="18"/>
+                <w:szCs w:val="18"/>
+              </w:rPr>
+            </w:pPr>
+            <w:r>
+              <w:rPr>
+                <w:rFonts w:ascii="Cambria" w:eastAsia="Cambria" w:hAnsi="Cambria" w:cs="Cambria"/>
+                <w:b/>
+                <w:sz w:val="18"/>
+                <w:szCs w:val="18"/>
+              </w:rPr>
+              <w:t>MONITORING FORM FOR BORROWED EQUIPMENT</w:t>
+            </w:r>
+          </w:p>
+        </w:tc>
+      </w:tr>
+    </w:tbl>
+    <w:tbl>
+      <w:tblPr>
+        <w:tblW w:w="5677" w:type="dxa"/>
+        <w:tblInd w:w="-7" w:type="dxa"/>
+        <w:tblBorders>
+          <w:top w:val="single" w:sz="4" w:space="0" w:color="auto"/>
+          <w:left w:val="single" w:sz="4" w:space="0" w:color="auto"/>
+          <w:bottom w:val="single" w:sz="4" w:space="0" w:color="auto"/>
+          <w:right w:val="single" w:sz="4" w:space="0" w:color="auto"/>
+          <w:insideH w:val="single" w:sz="4" w:space="0" w:color="auto"/>
+          <w:insideV w:val="single" w:sz="4" w:space="0" w:color="auto"/>
+        </w:tblBorders>
+        <w:tblLayout w:type="fixed"/>
+        <w:tblLook w:val="0000" w:firstRow="0" w:lastRow="0" w:firstColumn="0" w:lastColumn="0" w:noHBand="0" w:noVBand="0"/>
+      </w:tblPr>
+      <w:tblGrid>
+        <w:gridCol w:w="5660"/>
+        <w:gridCol w:w="17"/>
+      </w:tblGrid>
+      <w:tr>
+        <w:trPr>
+          <w:trHeight w:val="243"/>
+        </w:trPr>
+        <w:tc>
+          <w:tcPr>
+            <w:tcW w:w="5677" w:type="dxa"/>
+            <w:gridSpan w:val="2"/>
+            <w:tcBorders>
+              <w:top w:val="nil"/>
+              <w:left w:val="nil"/>
+              <w:bottom w:val="nil"/>
+              <w:right w:val="nil"/>
+            </w:tcBorders>
+          </w:tcPr>
+          <w:p>
+            <w:pPr>
+              <w:spacing w:after="0" w:line="360" w:lineRule="auto"/>
+              <w:rPr>
+                <w:rFonts w:ascii="Cambria" w:eastAsia="Cambria" w:hAnsi="Cambria" w:cs="Cambria"/>
+                <w:sz w:val="18"/>
+                <w:szCs w:val="16"/>
+                <w:u w:val="single"/>
+              </w:rPr>
+            </w:pPr>
+            <w:r>
+              <w:rPr>
+                <w:rFonts w:ascii="Cambria" w:eastAsia="Cambria" w:hAnsi="Cambria" w:cs="Cambria"/>
+                <w:sz w:val="18"/>
+                <w:szCs w:val="18"/>
+              </w:rPr>
+              <w:t>Remarks:</w:t>
+            </w:r>
+            <w:r>
+              <w:rPr>
+                <w:rFonts w:ascii="Cambria" w:eastAsia="Cambria" w:hAnsi="Cambria" w:cs="Cambria"/>
+                <w:sz w:val="18"/>
+                <w:szCs w:val="18"/>
+              </w:rPr>
+              <w:t xml:space="preserve"> </w:t>
+            </w:r>
+            <w:r>
+              <w:rPr>
+                <w:rFonts w:ascii="Cambria" w:eastAsia="Cambria" w:hAnsi="Cambria" w:cs="Cambria"/>
+                <w:sz w:val="18"/>
+                <w:szCs w:val="18"/>
+                <w:u w:val="single"/>
+              </w:rPr>
+              <w:t>{remarks}</w:t>
+            </w:r>
+          </w:p>
+        </w:tc>
+        <w:bookmarkStart w:id="0" w:name="_GoBack"/>
+        <w:bookmarkEnd w:id="0"/>
+      </w:tr>
+      <w:tr>
+        <w:trPr>
+          <w:gridAfter w:val="1"/>
+          <w:wAfter w:w="17" w:type="dxa"/>
+          <w:trHeight w:val="200"/>
+        </w:trPr>
+        <w:tc>
+          <w:tcPr>
+            <w:tcW w:w="5660" w:type="dxa"/>
+            <w:tcBorders>
+              <w:top w:val="nil"/>
+              <w:left w:val="nil"/>
+              <w:bottom w:val="nil"/>
+              <w:right w:val="nil"/>
+            </w:tcBorders>
+          </w:tcPr>
+          <w:p>
+            <w:pPr>
+              <w:spacing w:after="0" w:line="240" w:lineRule="auto"/>
+              <w:jc w:val="center"/>
+              <w:rPr>
+                <w:rFonts w:ascii="Cambria" w:eastAsia="Cambria" w:hAnsi="Cambria" w:cs="Cambria"/>
+                <w:sz w:val="18"/>
+                <w:szCs w:val="18"/>
+              </w:rPr>
+            </w:pPr>
+            <w:r>
+              <w:rPr>
+                <w:rFonts w:ascii="Cambria" w:eastAsia="Cambria" w:hAnsi="Cambria" w:cs="Cambria"/>
+                <w:sz w:val="18"/>
+                <w:szCs w:val="18"/>
+              </w:rPr>
+              <w:t>Monitored by:</w:t>
+            </w:r>
+          </w:p>
+        </w:tc>
+      </w:tr>
+      <w:tr>
+        <w:trPr>
+          <w:gridAfter w:val="1"/>
+          <w:wAfter w:w="17" w:type="dxa"/>
+          <w:trHeight w:val="230"/>
+        </w:trPr>
+        <w:tc>
+          <w:tcPr>
+            <w:tcW w:w="5660" w:type="dxa"/>
+            <w:tcBorders>
+              <w:top w:val="nil"/>
+              <w:left w:val="nil"/>
+              <w:bottom w:val="nil"/>
+              <w:right w:val="nil"/>
+            </w:tcBorders>
+          </w:tcPr>
+          <w:p>
+            <w:pPr>
+              <w:spacing w:after="0" w:line="240" w:lineRule="auto"/>
+              <w:jc w:val="center"/>
+              <w:rPr>
+                <w:rFonts w:ascii="Cambria" w:eastAsia="Cambria" w:hAnsi="Cambria" w:cs="Cambria"/>
+                <w:sz w:val="18"/>
+                <w:szCs w:val="18"/>
+              </w:rPr>
+            </w:pPr>
+            <w:r>
+              <w:rPr>
+                <w:rFonts w:ascii="Cambria" w:eastAsia="Cambria" w:hAnsi="Cambria" w:cs="Cambria"/>
+                <w:sz w:val="18"/>
+                <w:szCs w:val="18"/>
+                <w:u w:val="single"/>
+              </w:rPr>
+              <w:t>{</w:t>
+            </w:r>
+            <w:proofErr w:type="spellStart"/>
+            <w:r>
+              <w:rPr>
+                <w:rFonts w:ascii="Cambria" w:eastAsia="Cambria" w:hAnsi="Cambria" w:cs="Cambria"/>
+                <w:sz w:val="18"/>
+                <w:szCs w:val="18"/>
+                <w:u w:val="single"/>
+              </w:rPr>
+              <w:t>monitored_by</w:t>
+            </w:r>
+            <w:proofErr w:type="spellEnd"/>
+            <w:r>
+              <w:rPr>
+                <w:rFonts w:ascii="Cambria" w:eastAsia="Cambria" w:hAnsi="Cambria" w:cs="Cambria"/>
+                <w:sz w:val="18"/>
+                <w:szCs w:val="18"/>
+                <w:u w:val="single"/>
+              </w:rPr>
+              <w:t>}</w:t>
+            </w:r>
+          </w:p>
+        </w:tc>
+      </w:tr>
+      <w:tr>
+        <w:trPr>
+          <w:gridAfter w:val="1"/>
+          <w:wAfter w:w="17" w:type="dxa"/>
+          <w:trHeight w:val="232"/>
+        </w:trPr>
+        <w:tc>
+          <w:tcPr>
+            <w:tcW w:w="5660" w:type="dxa"/>
+            <w:tcBorders>
+              <w:top w:val="nil"/>
+              <w:left w:val="nil"/>
+              <w:bottom w:val="nil"/>
+              <w:right w:val="nil"/>
+            </w:tcBorders>
+          </w:tcPr>
+          <w:p>
+            <w:pPr>
+              <w:spacing w:after="0" w:line="360" w:lineRule="auto"/>
+              <w:jc w:val="center"/>
+              <w:rPr>
+                <w:rFonts w:ascii="Cambria" w:eastAsia="Cambria" w:hAnsi="Cambria" w:cs="Cambria"/>
+                <w:sz w:val="18"/>
+                <w:szCs w:val="18"/>
+              </w:rPr>
+            </w:pPr>
+            <w:r>
+              <w:rPr>
+                <w:rFonts w:ascii="Cambria" w:eastAsia="Cambria" w:hAnsi="Cambria" w:cs="Cambria"/>
+                <w:sz w:val="18"/>
+                <w:szCs w:val="18"/>
+              </w:rPr>
+              <w:t>Laboratory Custodian</w:t>
+            </w:r>
+          </w:p>
+        </w:tc>
+      </w:tr>
+    </w:tbl>
     <w:p>
       <w:pPr>
-        <w:pStyle w:val="Normal"/>
-        <w:spacing w:lineRule="auto" w:line="360" w:before="0" w:after="0"/>
+        <w:tabs>
+          <w:tab w:val="left" w:pos="1250"/>
+        </w:tabs>
         <w:rPr>
-          <w:rFonts w:ascii="Cambria" w:hAnsi="Cambria" w:eastAsia="Cambria" w:cs="Cambria"/>
-          <w:sz w:val="18"/>
+          <w:rFonts w:ascii="Cambria" w:eastAsia="Cambria" w:hAnsi="Cambria" w:cs="Cambria"/>
+          <w:sz w:val="2"/>
           <w:szCs w:val="18"/>
         </w:rPr>
       </w:pPr>
-      <w:r>
-        <w:rPr>
-          <w:rFonts w:eastAsia="Cambria" w:cs="Cambria" w:ascii="Cambria" w:hAnsi="Cambria"/>
-          <w:sz w:val="18"/>
-          <w:szCs w:val="18"/>
-        </w:rPr>
-        <w:t>Requested by:</w:t>
-        <w:tab/>
-        <w:tab/>
-        <w:tab/>
-        <w:t>Approved by:</w:t>
-      </w:r>
-    </w:p>
-    <w:p>
-      <w:pPr>
-        <w:pStyle w:val="Normal"/>
-        <w:spacing w:lineRule="auto" w:line="240" w:before="0" w:after="0"/>
-        <w:rPr>
-          <w:rFonts w:ascii="Cambria" w:hAnsi="Cambria" w:eastAsia="Cambria" w:cs="Cambria"/>
-          <w:sz w:val="16"/>
-          <w:szCs w:val="16"/>
-          <w:u w:val="single"/>
-        </w:rPr>
-      </w:pPr>
-      <w:r>
-        <w:rPr>
-          <w:rFonts w:eastAsia="Cambria" w:cs="Cambria" w:ascii="Cambria" w:hAnsi="Cambria"/>
-          <w:sz w:val="18"/>
-          <w:szCs w:val="18"/>
-          <w:u w:val="single"/>
-        </w:rPr>
-        <w:t xml:space="preserve">  </w:t>
-      </w:r>
-      <w:r>
-        <w:rPr>
-          <w:rFonts w:eastAsia="Cambria" w:cs="Cambria" w:ascii="Cambria" w:hAnsi="Cambria"/>
-          <w:sz w:val="18"/>
-          <w:szCs w:val="18"/>
-          <w:u w:val="single"/>
-        </w:rPr>
-        <w:t>{requested_by}</w:t>
-      </w:r>
-      <w:r>
-        <w:rPr>
-          <w:rFonts w:eastAsia="Cambria" w:cs="Cambria" w:ascii="Cambria" w:hAnsi="Cambria"/>
-          <w:sz w:val="18"/>
-          <w:szCs w:val="18"/>
-        </w:rPr>
-        <w:tab/>
-        <w:tab/>
-        <w:tab/>
-        <w:t xml:space="preserve">     </w:t>
-      </w:r>
-      <w:r>
-        <w:rPr>
-          <w:rFonts w:eastAsia="Cambria" w:cs="Cambria" w:ascii="Cambria" w:hAnsi="Cambria"/>
-          <w:sz w:val="16"/>
-          <w:szCs w:val="16"/>
-          <w:u w:val="single"/>
-        </w:rPr>
-        <w:t>{approved_by}</w:t>
-      </w:r>
-    </w:p>
-    <w:p>
-      <w:pPr>
-        <w:pStyle w:val="Normal"/>
-        <w:spacing w:lineRule="auto" w:line="240" w:before="0" w:after="0"/>
-        <w:rPr>
-          <w:rFonts w:ascii="Cambria" w:hAnsi="Cambria" w:eastAsia="Cambria" w:cs="Cambria"/>
-          <w:sz w:val="18"/>
-          <w:szCs w:val="18"/>
-        </w:rPr>
-      </w:pPr>
-      <w:r>
-        <w:rPr>
-          <w:rFonts w:eastAsia="Cambria" w:cs="Cambria" w:ascii="Cambria" w:hAnsi="Cambria"/>
-          <w:sz w:val="18"/>
-          <w:szCs w:val="18"/>
-        </w:rPr>
-        <w:t xml:space="preserve"> </w:t>
-      </w:r>
-      <w:r>
-        <w:rPr>
-          <w:rFonts w:eastAsia="Cambria" w:cs="Cambria" w:ascii="Cambria" w:hAnsi="Cambria"/>
-          <w:sz w:val="18"/>
-          <w:szCs w:val="18"/>
-        </w:rPr>
-        <w:t>Faculty Signature</w:t>
-        <w:tab/>
-        <w:tab/>
-        <w:t xml:space="preserve">                            Dean</w:t>
-      </w:r>
-    </w:p>
-    <w:p>
-      <w:pPr>
-        <w:pStyle w:val="Normal"/>
-        <w:spacing w:lineRule="auto" w:line="360" w:before="0" w:after="0"/>
-        <w:rPr>
-          <w:rFonts w:ascii="Cambria" w:hAnsi="Cambria" w:eastAsia="Cambria" w:cs="Cambria"/>
-          <w:sz w:val="18"/>
-          <w:szCs w:val="18"/>
-        </w:rPr>
-      </w:pPr>
-      <w:r>
-        <w:rPr>
-          <w:rFonts w:eastAsia="Cambria" w:cs="Cambria" w:ascii="Cambria" w:hAnsi="Cambria"/>
-          <w:sz w:val="18"/>
-          <w:szCs w:val="18"/>
-        </w:rPr>
-        <w:t>----------------------------------------------------------------------------------------------</w:t>
-      </w:r>
-    </w:p>
-    <w:p>
-      <w:pPr>
-        <w:pStyle w:val="Normal"/>
-        <w:spacing w:lineRule="auto" w:line="240" w:before="0" w:after="0"/>
-        <w:jc w:val="center"/>
-        <w:rPr>
-          <w:rFonts w:ascii="Cambria" w:hAnsi="Cambria" w:eastAsia="Cambria" w:cs="Cambria"/>
-          <w:b/>
-          <w:sz w:val="18"/>
-          <w:szCs w:val="18"/>
-        </w:rPr>
-      </w:pPr>
-      <w:r>
-        <w:rPr>
-          <w:rFonts w:eastAsia="Cambria" w:cs="Cambria" w:ascii="Cambria" w:hAnsi="Cambria"/>
-          <w:b/>
-          <w:sz w:val="18"/>
-          <w:szCs w:val="18"/>
-        </w:rPr>
-        <w:t>MONITORING FORM FOR BORROWED EQUIPMENT</w:t>
-      </w:r>
-    </w:p>
-    <w:p>
-      <w:pPr>
-        <w:pStyle w:val="Normal"/>
-        <w:spacing w:lineRule="auto" w:line="360" w:before="0" w:after="0"/>
-        <w:rPr>
-          <w:rFonts w:ascii="Cambria" w:hAnsi="Cambria" w:eastAsia="Cambria" w:cs="Cambria"/>
-          <w:sz w:val="18"/>
-          <w:szCs w:val="18"/>
-          <w:u w:val="single"/>
-        </w:rPr>
-      </w:pPr>
-      <w:r>
-        <w:rPr>
-          <w:rFonts w:eastAsia="Cambria" w:cs="Cambria" w:ascii="Cambria" w:hAnsi="Cambria"/>
-          <w:sz w:val="18"/>
-          <w:szCs w:val="18"/>
-        </w:rPr>
-        <w:t xml:space="preserve">Remarks: </w:t>
-      </w:r>
-      <w:r>
-        <w:rPr>
-          <w:rFonts w:eastAsia="Cambria" w:cs="Cambria" w:ascii="Cambria" w:hAnsi="Cambria"/>
-          <w:sz w:val="18"/>
-          <w:szCs w:val="18"/>
-          <w:u w:val="single"/>
-        </w:rPr>
-        <w:t>{remarks}</w:t>
-      </w:r>
-    </w:p>
-    <w:p>
-      <w:pPr>
-        <w:pStyle w:val="Normal"/>
-        <w:spacing w:lineRule="auto" w:line="360" w:before="0" w:after="0"/>
-        <w:rPr>
-          <w:rFonts w:ascii="Cambria" w:hAnsi="Cambria" w:eastAsia="Cambria" w:cs="Cambria"/>
-          <w:sz w:val="18"/>
-          <w:szCs w:val="18"/>
-        </w:rPr>
-      </w:pPr>
-      <w:r>
-        <w:rPr>
-          <w:rFonts w:eastAsia="Cambria" w:cs="Cambria" w:ascii="Cambria" w:hAnsi="Cambria"/>
-          <w:sz w:val="18"/>
-          <w:szCs w:val="18"/>
-        </w:rPr>
-      </w:r>
-    </w:p>
-    <w:p>
-      <w:pPr>
-        <w:pStyle w:val="Normal"/>
-        <w:spacing w:lineRule="auto" w:line="240" w:before="0" w:after="0"/>
-        <w:jc w:val="center"/>
-        <w:rPr>
-          <w:rFonts w:ascii="Cambria" w:hAnsi="Cambria" w:eastAsia="Cambria" w:cs="Cambria"/>
-          <w:sz w:val="18"/>
-          <w:szCs w:val="18"/>
-        </w:rPr>
-      </w:pPr>
-      <w:r>
-        <w:rPr>
-          <w:rFonts w:eastAsia="Cambria" w:cs="Cambria" w:ascii="Cambria" w:hAnsi="Cambria"/>
-          <w:sz w:val="18"/>
-          <w:szCs w:val="18"/>
-        </w:rPr>
-      </w:r>
-    </w:p>
-    <w:p>
-      <w:pPr>
-        <w:pStyle w:val="Normal"/>
-        <w:spacing w:lineRule="auto" w:line="240" w:before="0" w:after="0"/>
-        <w:jc w:val="center"/>
-        <w:rPr>
-          <w:rFonts w:ascii="Cambria" w:hAnsi="Cambria" w:eastAsia="Cambria" w:cs="Cambria"/>
-          <w:sz w:val="18"/>
-          <w:szCs w:val="18"/>
-        </w:rPr>
-      </w:pPr>
-      <w:r>
-        <w:rPr>
-          <w:rFonts w:eastAsia="Cambria" w:cs="Cambria" w:ascii="Cambria" w:hAnsi="Cambria"/>
-          <w:sz w:val="18"/>
-          <w:szCs w:val="18"/>
-        </w:rPr>
-        <w:t>Monitored by:</w:t>
-      </w:r>
-    </w:p>
-    <w:p>
-      <w:pPr>
-        <w:pStyle w:val="Normal"/>
-        <w:spacing w:lineRule="auto" w:line="240" w:before="0" w:after="0"/>
-        <w:rPr>
-          <w:rFonts w:ascii="Cambria" w:hAnsi="Cambria" w:eastAsia="Cambria" w:cs="Cambria"/>
-          <w:sz w:val="18"/>
-          <w:szCs w:val="18"/>
-          <w:u w:val="single"/>
-        </w:rPr>
-      </w:pPr>
-      <w:r>
-        <w:rPr>
-          <w:rFonts w:eastAsia="Cambria" w:cs="Cambria" w:ascii="Cambria" w:hAnsi="Cambria"/>
-          <w:sz w:val="18"/>
-          <w:szCs w:val="18"/>
-        </w:rPr>
-        <w:tab/>
-        <w:tab/>
-        <w:t xml:space="preserve">         </w:t>
-      </w:r>
-      <w:bookmarkStart w:id="0" w:name="_GoBack"/>
-      <w:bookmarkEnd w:id="0"/>
-      <w:r>
-        <w:rPr>
-          <w:rFonts w:eastAsia="Cambria" w:cs="Cambria" w:ascii="Cambria" w:hAnsi="Cambria"/>
-          <w:sz w:val="18"/>
-          <w:szCs w:val="18"/>
-        </w:rPr>
-        <w:t xml:space="preserve">  </w:t>
-      </w:r>
-      <w:r>
-        <w:rPr>
-          <w:rFonts w:eastAsia="Cambria" w:cs="Cambria" w:ascii="Cambria" w:hAnsi="Cambria"/>
-          <w:sz w:val="18"/>
-          <w:szCs w:val="18"/>
-          <w:u w:val="single"/>
-        </w:rPr>
-        <w:t>{monitored_by}</w:t>
-      </w:r>
-    </w:p>
-    <w:p>
-      <w:pPr>
-        <w:pStyle w:val="Normal"/>
-        <w:spacing w:lineRule="auto" w:line="240" w:before="0" w:after="0"/>
-        <w:jc w:val="center"/>
-        <w:rPr>
-          <w:rFonts w:ascii="Cambria" w:hAnsi="Cambria" w:eastAsia="Cambria" w:cs="Cambria"/>
-          <w:sz w:val="18"/>
-          <w:szCs w:val="18"/>
-        </w:rPr>
-      </w:pPr>
-      <w:r>
-        <w:rPr>
-          <w:rFonts w:eastAsia="Cambria" w:cs="Cambria" w:ascii="Cambria" w:hAnsi="Cambria"/>
-          <w:sz w:val="18"/>
-          <w:szCs w:val="18"/>
-        </w:rPr>
-        <w:t>Laboratory Custodian</w:t>
-      </w:r>
     </w:p>
     <w:sectPr>
-      <w:headerReference w:type="even" r:id="rId2"/>
-      <w:headerReference w:type="default" r:id="rId3"/>
-      <w:headerReference w:type="first" r:id="rId4"/>
-      <w:footerReference w:type="even" r:id="rId5"/>
-      <w:footerReference w:type="default" r:id="rId6"/>
-      <w:footerReference w:type="first" r:id="rId7"/>
-      <w:type w:val="nextPage"/>
+      <w:headerReference w:type="default" r:id="rId7"/>
+      <w:footerReference w:type="default" r:id="rId8"/>
+      <w:headerReference w:type="first" r:id="rId9"/>
+      <w:footerReference w:type="first" r:id="rId10"/>
       <w:pgSz w:w="6120" w:h="7937"/>
-      <w:pgMar w:left="272" w:right="181" w:gutter="0" w:header="181" w:top="567" w:footer="0" w:bottom="176"/>
-      <w:paperSrc w:first="0" w:other="0"/>
-      <w:pgNumType w:start="1" w:fmt="decimal"/>
-      <w:formProt w:val="false"/>
-      <w:textDirection w:val="lrTb"/>
-      <w:docGrid w:type="default" w:linePitch="100" w:charSpace="4096"/>
+      <w:pgMar w:top="567" w:right="181" w:bottom="176" w:left="272" w:header="181" w:footer="0" w:gutter="0"/>
+      <w:pgNumType w:start="1"/>
+      <w:cols w:space="720"/>
+      <w:formProt w:val="0"/>
+      <w:docGrid w:linePitch="100" w:charSpace="4096"/>
     </w:sectPr>
   </w:body>
 </w:document>
 </file>
 
+<file path=word/endnotes.xml><?xml version="1.0" encoding="utf-8"?>
+<w:endnotes xmlns:wpc="http://schemas.microsoft.com/office/word/2010/wordprocessingCanvas" xmlns:cx="http://schemas.microsoft.com/office/drawing/2014/chartex" xmlns:mc="http://schemas.openxmlformats.org/markup-compatibility/2006" xmlns:o="urn:schemas-microsoft-com:office:office" xmlns:r="http://schemas.openxmlformats.org/officeDocument/2006/relationships" xmlns:m="http://schemas.openxmlformats.org/officeDocument/2006/math" xmlns:v="urn:schemas-microsoft-com:vml" xmlns:wp14="http://schemas.microsoft.com/office/word/2010/wordprocessingDrawing" xmlns:wp="http://schemas.openxmlformats.org/drawingml/2006/wordprocessingDrawing" xmlns:w10="urn:schemas-microsoft-com:office:word" xmlns:w="http://schemas.openxmlformats.org/wordprocessingml/2006/main" xmlns:w14="http://schemas.microsoft.com/office/word/2010/wordml" xmlns:w15="http://schemas.microsoft.com/office/word/2012/wordml" xmlns:w16se="http://schemas.microsoft.com/office/word/2015/wordml/symex" xmlns:wpg="http://schemas.microsoft.com/office/word/2010/wordprocessingGroup" xmlns:wpi="http://schemas.microsoft.com/office/word/2010/wordprocessingInk" xmlns:wne="http://schemas.microsoft.com/office/word/2006/wordml" xmlns:wps="http://schemas.microsoft.com/office/word/2010/wordprocessingShape" mc:Ignorable="w14 w15 w16se wp14">
+  <w:endnote w:type="separator" w:id="-1">
+    <w:p>
+      <w:pPr>
+        <w:spacing w:after="0" w:line="240" w:lineRule="auto"/>
+      </w:pPr>
+      <w:r>
+        <w:separator/>
+      </w:r>
+    </w:p>
+  </w:endnote>
+  <w:endnote w:type="continuationSeparator" w:id="0">
+    <w:p>
+      <w:pPr>
+        <w:spacing w:after="0" w:line="240" w:lineRule="auto"/>
+      </w:pPr>
+      <w:r>
+        <w:continuationSeparator/>
+      </w:r>
+    </w:p>
+  </w:endnote>
+</w:endnotes>
+</file>
+
 <file path=word/footer1.xml><?xml version="1.0" encoding="utf-8"?>
-<w:ftr xmlns:o="urn:schemas-microsoft-com:office:office" xmlns:r="http://schemas.openxmlformats.org/officeDocument/2006/relationships" xmlns:v="urn:schemas-microsoft-com:vml" xmlns:w="http://schemas.openxmlformats.org/wordprocessingml/2006/main" xmlns:w10="urn:schemas-microsoft-com:office:word" xmlns:wp="http://schemas.openxmlformats.org/drawingml/2006/wordprocessingDrawing" xmlns:wps="http://schemas.microsoft.com/office/word/2010/wordprocessingShape" xmlns:wpg="http://schemas.microsoft.com/office/word/2010/wordprocessingGroup" xmlns:mc="http://schemas.openxmlformats.org/markup-compatibility/2006" xmlns:wp14="http://schemas.microsoft.com/office/word/2010/wordprocessingDrawing" xmlns:w14="http://schemas.microsoft.com/office/word/2010/wordml" xmlns:w15="http://schemas.microsoft.com/office/word/2012/wordml" mc:Ignorable="w14 wp14 w15">
+<w:ftr xmlns:wpc="http://schemas.microsoft.com/office/word/2010/wordprocessingCanvas" xmlns:cx="http://schemas.microsoft.com/office/drawing/2014/chartex" xmlns:mc="http://schemas.openxmlformats.org/markup-compatibility/2006" xmlns:o="urn:schemas-microsoft-com:office:office" xmlns:r="http://schemas.openxmlformats.org/officeDocument/2006/relationships" xmlns:m="http://schemas.openxmlformats.org/officeDocument/2006/math" xmlns:v="urn:schemas-microsoft-com:vml" xmlns:wp14="http://schemas.microsoft.com/office/word/2010/wordprocessingDrawing" xmlns:wp="http://schemas.openxmlformats.org/drawingml/2006/wordprocessingDrawing" xmlns:w10="urn:schemas-microsoft-com:office:word" xmlns:w="http://schemas.openxmlformats.org/wordprocessingml/2006/main" xmlns:w14="http://schemas.microsoft.com/office/word/2010/wordml" xmlns:w15="http://schemas.microsoft.com/office/word/2012/wordml" xmlns:w16se="http://schemas.microsoft.com/office/word/2015/wordml/symex" xmlns:wpg="http://schemas.microsoft.com/office/word/2010/wordprocessingGroup" xmlns:wpi="http://schemas.microsoft.com/office/word/2010/wordprocessingInk" xmlns:wne="http://schemas.microsoft.com/office/word/2006/wordml" xmlns:wps="http://schemas.microsoft.com/office/word/2010/wordprocessingShape" mc:Ignorable="w14 w15 w16se wp14">
   <w:p>
     <w:pPr>
-      <w:pStyle w:val="Normal"/>
-      <w:spacing w:before="0" w:after="200"/>
-      <w:rPr/>
-    </w:pPr>
-    <w:r>
-      <w:rPr/>
-    </w:r>
-  </w:p>
-</w:ftr>
-</file>
-
-<file path=word/footer2.xml><?xml version="1.0" encoding="utf-8"?>
-<w:ftr xmlns:o="urn:schemas-microsoft-com:office:office" xmlns:r="http://schemas.openxmlformats.org/officeDocument/2006/relationships" xmlns:v="urn:schemas-microsoft-com:vml" xmlns:w="http://schemas.openxmlformats.org/wordprocessingml/2006/main" xmlns:w10="urn:schemas-microsoft-com:office:word" xmlns:wp="http://schemas.openxmlformats.org/drawingml/2006/wordprocessingDrawing" xmlns:wps="http://schemas.microsoft.com/office/word/2010/wordprocessingShape" xmlns:wpg="http://schemas.microsoft.com/office/word/2010/wordprocessingGroup" xmlns:mc="http://schemas.openxmlformats.org/markup-compatibility/2006" xmlns:wp14="http://schemas.microsoft.com/office/word/2010/wordprocessingDrawing" xmlns:w14="http://schemas.microsoft.com/office/word/2010/wordml" xmlns:w15="http://schemas.microsoft.com/office/word/2012/wordml" mc:Ignorable="w14 wp14 w15">
-  <w:p>
-    <w:pPr>
-      <w:pStyle w:val="Normal"/>
-      <w:widowControl w:val="false"/>
-      <w:spacing w:before="0" w:after="0"/>
+      <w:widowControl w:val="0"/>
+      <w:spacing w:after="0"/>
       <w:rPr>
         <w:color w:val="000000"/>
       </w:rPr>
     </w:pPr>
-    <w:r>
-      <w:rPr>
-        <w:color w:val="000000"/>
-      </w:rPr>
-    </w:r>
   </w:p>
   <w:tbl>
     <w:tblPr>
-      <w:tblStyle w:val="a0"/>
       <w:tblW w:w="5562" w:type="dxa"/>
-      <w:jc w:val="start"/>
       <w:tblInd w:w="108" w:type="dxa"/>
       <w:tblLayout w:type="fixed"/>
-      <w:tblCellMar>
-        <w:top w:w="0" w:type="dxa"/>
-        <w:start w:w="108" w:type="dxa"/>
-        <w:bottom w:w="0" w:type="dxa"/>
-        <w:end w:w="108" w:type="dxa"/>
-      </w:tblCellMar>
-      <w:tblLook w:firstRow="0" w:noVBand="1" w:lastRow="0" w:firstColumn="0" w:lastColumn="0" w:noHBand="0" w:val="0400"/>
+      <w:tblLook w:val="0400" w:firstRow="0" w:lastRow="0" w:firstColumn="0" w:lastColumn="0" w:noHBand="0" w:noVBand="1"/>
     </w:tblPr>
     <w:tblGrid>
-      <w:gridCol w:w="2159"/>
+      <w:gridCol w:w="2160"/>
       <w:gridCol w:w="1332"/>
       <w:gridCol w:w="990"/>
       <w:gridCol w:w="1080"/>
     </w:tblGrid>
     <w:tr>
-      <w:trPr/>
       <w:tc>
         <w:tcPr>
           <w:tcW w:w="2159" w:type="dxa"/>
@@ -745,31 +1245,20 @@
         </w:tcPr>
         <w:p>
           <w:pPr>
-            <w:pStyle w:val="Normal"/>
             <w:tabs>
-              <w:tab w:val="clear" w:pos="720"/>
-              <w:tab w:val="center" w:pos="4680" w:leader="none"/>
-              <w:tab w:val="right" w:pos="9360" w:leader="none"/>
+              <w:tab w:val="center" w:pos="4680"/>
+              <w:tab w:val="right" w:pos="9360"/>
             </w:tabs>
-            <w:spacing w:lineRule="auto" w:line="240" w:before="0" w:after="0"/>
+            <w:spacing w:after="0" w:line="240" w:lineRule="auto"/>
             <w:jc w:val="center"/>
             <w:rPr>
-              <w:rFonts w:ascii="Cambria" w:hAnsi="Cambria" w:eastAsia="Cambria" w:cs="Cambria"/>
+              <w:rFonts w:ascii="Cambria" w:eastAsia="Cambria" w:hAnsi="Cambria" w:cs="Cambria"/>
               <w:b/>
               <w:color w:val="000000"/>
               <w:sz w:val="6"/>
               <w:szCs w:val="6"/>
             </w:rPr>
           </w:pPr>
-          <w:r>
-            <w:rPr>
-              <w:rFonts w:eastAsia="Cambria" w:cs="Cambria" w:ascii="Cambria" w:hAnsi="Cambria"/>
-              <w:b/>
-              <w:color w:val="000000"/>
-              <w:sz w:val="6"/>
-              <w:szCs w:val="6"/>
-            </w:rPr>
-          </w:r>
         </w:p>
       </w:tc>
       <w:tc>
@@ -779,35 +1268,24 @@
             <w:top w:val="single" w:sz="24" w:space="0" w:color="800000"/>
             <w:bottom w:val="single" w:sz="4" w:space="0" w:color="000000"/>
           </w:tcBorders>
-          <w:shd w:color="auto" w:fill="auto" w:val="clear"/>
+          <w:shd w:val="clear" w:color="auto" w:fill="auto"/>
         </w:tcPr>
         <w:p>
           <w:pPr>
-            <w:pStyle w:val="Normal"/>
             <w:tabs>
-              <w:tab w:val="clear" w:pos="720"/>
-              <w:tab w:val="center" w:pos="4680" w:leader="none"/>
-              <w:tab w:val="right" w:pos="9360" w:leader="none"/>
+              <w:tab w:val="center" w:pos="4680"/>
+              <w:tab w:val="right" w:pos="9360"/>
             </w:tabs>
-            <w:spacing w:lineRule="auto" w:line="240" w:before="0" w:after="0"/>
+            <w:spacing w:after="0" w:line="240" w:lineRule="auto"/>
             <w:jc w:val="center"/>
             <w:rPr>
-              <w:rFonts w:ascii="Cambria" w:hAnsi="Cambria" w:eastAsia="Cambria" w:cs="Cambria"/>
+              <w:rFonts w:ascii="Cambria" w:eastAsia="Cambria" w:hAnsi="Cambria" w:cs="Cambria"/>
               <w:b/>
               <w:color w:val="000000"/>
               <w:sz w:val="6"/>
               <w:szCs w:val="6"/>
             </w:rPr>
           </w:pPr>
-          <w:r>
-            <w:rPr>
-              <w:rFonts w:eastAsia="Cambria" w:cs="Cambria" w:ascii="Cambria" w:hAnsi="Cambria"/>
-              <w:b/>
-              <w:color w:val="000000"/>
-              <w:sz w:val="6"/>
-              <w:szCs w:val="6"/>
-            </w:rPr>
-          </w:r>
         </w:p>
       </w:tc>
       <w:tc>
@@ -817,35 +1295,24 @@
             <w:top w:val="single" w:sz="24" w:space="0" w:color="800000"/>
             <w:bottom w:val="single" w:sz="4" w:space="0" w:color="000000"/>
           </w:tcBorders>
-          <w:shd w:color="auto" w:fill="auto" w:val="clear"/>
+          <w:shd w:val="clear" w:color="auto" w:fill="auto"/>
         </w:tcPr>
         <w:p>
           <w:pPr>
-            <w:pStyle w:val="Normal"/>
             <w:tabs>
-              <w:tab w:val="clear" w:pos="720"/>
-              <w:tab w:val="center" w:pos="4680" w:leader="none"/>
-              <w:tab w:val="right" w:pos="9360" w:leader="none"/>
+              <w:tab w:val="center" w:pos="4680"/>
+              <w:tab w:val="right" w:pos="9360"/>
             </w:tabs>
-            <w:spacing w:lineRule="auto" w:line="240" w:before="0" w:after="0"/>
+            <w:spacing w:after="0" w:line="240" w:lineRule="auto"/>
             <w:jc w:val="center"/>
             <w:rPr>
-              <w:rFonts w:ascii="Cambria" w:hAnsi="Cambria" w:eastAsia="Cambria" w:cs="Cambria"/>
+              <w:rFonts w:ascii="Cambria" w:eastAsia="Cambria" w:hAnsi="Cambria" w:cs="Cambria"/>
               <w:b/>
               <w:color w:val="000000"/>
               <w:sz w:val="6"/>
               <w:szCs w:val="6"/>
             </w:rPr>
           </w:pPr>
-          <w:r>
-            <w:rPr>
-              <w:rFonts w:eastAsia="Cambria" w:cs="Cambria" w:ascii="Cambria" w:hAnsi="Cambria"/>
-              <w:b/>
-              <w:color w:val="000000"/>
-              <w:sz w:val="6"/>
-              <w:szCs w:val="6"/>
-            </w:rPr>
-          </w:r>
         </w:p>
       </w:tc>
       <w:tc>
@@ -858,72 +1325,50 @@
         </w:tcPr>
         <w:p>
           <w:pPr>
-            <w:pStyle w:val="Normal"/>
             <w:tabs>
-              <w:tab w:val="clear" w:pos="720"/>
-              <w:tab w:val="center" w:pos="4680" w:leader="none"/>
-              <w:tab w:val="right" w:pos="9360" w:leader="none"/>
+              <w:tab w:val="center" w:pos="4680"/>
+              <w:tab w:val="right" w:pos="9360"/>
             </w:tabs>
-            <w:spacing w:lineRule="auto" w:line="240" w:before="0" w:after="0"/>
+            <w:spacing w:after="0" w:line="240" w:lineRule="auto"/>
             <w:jc w:val="center"/>
             <w:rPr>
-              <w:rFonts w:ascii="Cambria" w:hAnsi="Cambria" w:eastAsia="Cambria" w:cs="Cambria"/>
+              <w:rFonts w:ascii="Cambria" w:eastAsia="Cambria" w:hAnsi="Cambria" w:cs="Cambria"/>
               <w:b/>
               <w:color w:val="000000"/>
               <w:sz w:val="6"/>
               <w:szCs w:val="6"/>
             </w:rPr>
           </w:pPr>
-          <w:r>
-            <w:rPr>
-              <w:rFonts w:eastAsia="Cambria" w:cs="Cambria" w:ascii="Cambria" w:hAnsi="Cambria"/>
-              <w:b/>
-              <w:color w:val="000000"/>
-              <w:sz w:val="6"/>
-              <w:szCs w:val="6"/>
-            </w:rPr>
-          </w:r>
         </w:p>
       </w:tc>
     </w:tr>
     <w:tr>
       <w:trPr>
-        <w:trHeight w:val="146" w:hRule="atLeast"/>
+        <w:trHeight w:val="146"/>
       </w:trPr>
       <w:tc>
         <w:tcPr>
           <w:tcW w:w="2159" w:type="dxa"/>
           <w:tcBorders>
-            <w:end w:val="single" w:sz="4" w:space="0" w:color="000000"/>
+            <w:right w:val="single" w:sz="4" w:space="0" w:color="000000"/>
           </w:tcBorders>
         </w:tcPr>
         <w:p>
           <w:pPr>
-            <w:pStyle w:val="Normal"/>
             <w:tabs>
-              <w:tab w:val="clear" w:pos="720"/>
-              <w:tab w:val="center" w:pos="4680" w:leader="none"/>
-              <w:tab w:val="right" w:pos="9360" w:leader="none"/>
+              <w:tab w:val="center" w:pos="4680"/>
+              <w:tab w:val="right" w:pos="9360"/>
             </w:tabs>
-            <w:spacing w:lineRule="auto" w:line="240" w:before="0" w:after="0"/>
+            <w:spacing w:after="0" w:line="240" w:lineRule="auto"/>
             <w:jc w:val="center"/>
             <w:rPr>
-              <w:rFonts w:ascii="Cambria" w:hAnsi="Cambria" w:eastAsia="Cambria" w:cs="Cambria"/>
+              <w:rFonts w:ascii="Cambria" w:eastAsia="Cambria" w:hAnsi="Cambria" w:cs="Cambria"/>
               <w:b/>
               <w:color w:val="000000"/>
               <w:sz w:val="10"/>
               <w:szCs w:val="10"/>
             </w:rPr>
           </w:pPr>
-          <w:r>
-            <w:rPr>
-              <w:rFonts w:eastAsia="Cambria" w:cs="Cambria" w:ascii="Cambria" w:hAnsi="Cambria"/>
-              <w:b/>
-              <w:color w:val="000000"/>
-              <w:sz w:val="10"/>
-              <w:szCs w:val="10"/>
-            </w:rPr>
-          </w:r>
         </w:p>
       </w:tc>
       <w:tc>
@@ -931,24 +1376,22 @@
           <w:tcW w:w="1332" w:type="dxa"/>
           <w:tcBorders>
             <w:top w:val="single" w:sz="4" w:space="0" w:color="000000"/>
-            <w:start w:val="single" w:sz="4" w:space="0" w:color="000000"/>
+            <w:left w:val="single" w:sz="4" w:space="0" w:color="000000"/>
             <w:bottom w:val="single" w:sz="4" w:space="0" w:color="000000"/>
-            <w:end w:val="single" w:sz="4" w:space="0" w:color="000000"/>
+            <w:right w:val="single" w:sz="4" w:space="0" w:color="000000"/>
           </w:tcBorders>
-          <w:shd w:color="auto" w:fill="auto" w:val="clear"/>
+          <w:shd w:val="clear" w:color="auto" w:fill="auto"/>
         </w:tcPr>
         <w:p>
           <w:pPr>
-            <w:pStyle w:val="Normal"/>
             <w:tabs>
-              <w:tab w:val="clear" w:pos="720"/>
-              <w:tab w:val="center" w:pos="4680" w:leader="none"/>
-              <w:tab w:val="right" w:pos="9360" w:leader="none"/>
+              <w:tab w:val="center" w:pos="4680"/>
+              <w:tab w:val="right" w:pos="9360"/>
             </w:tabs>
-            <w:spacing w:lineRule="auto" w:line="240" w:before="0" w:after="0"/>
+            <w:spacing w:after="0" w:line="240" w:lineRule="auto"/>
             <w:jc w:val="center"/>
             <w:rPr>
-              <w:rFonts w:ascii="Cambria" w:hAnsi="Cambria" w:eastAsia="Cambria" w:cs="Cambria"/>
+              <w:rFonts w:ascii="Cambria" w:eastAsia="Cambria" w:hAnsi="Cambria" w:cs="Cambria"/>
               <w:b/>
               <w:color w:val="000000"/>
               <w:sz w:val="10"/>
@@ -957,7 +1400,7 @@
           </w:pPr>
           <w:r>
             <w:rPr>
-              <w:rFonts w:eastAsia="Cambria" w:cs="Cambria" w:ascii="Cambria" w:hAnsi="Cambria"/>
+              <w:rFonts w:ascii="Cambria" w:eastAsia="Cambria" w:hAnsi="Cambria" w:cs="Cambria"/>
               <w:b/>
               <w:color w:val="000000"/>
               <w:sz w:val="10"/>
@@ -972,24 +1415,22 @@
           <w:tcW w:w="990" w:type="dxa"/>
           <w:tcBorders>
             <w:top w:val="single" w:sz="4" w:space="0" w:color="000000"/>
-            <w:start w:val="single" w:sz="4" w:space="0" w:color="000000"/>
+            <w:left w:val="single" w:sz="4" w:space="0" w:color="000000"/>
             <w:bottom w:val="single" w:sz="4" w:space="0" w:color="000000"/>
-            <w:end w:val="single" w:sz="4" w:space="0" w:color="000000"/>
+            <w:right w:val="single" w:sz="4" w:space="0" w:color="000000"/>
           </w:tcBorders>
-          <w:shd w:color="auto" w:fill="auto" w:val="clear"/>
+          <w:shd w:val="clear" w:color="auto" w:fill="auto"/>
         </w:tcPr>
         <w:p>
           <w:pPr>
-            <w:pStyle w:val="Normal"/>
             <w:tabs>
-              <w:tab w:val="clear" w:pos="720"/>
-              <w:tab w:val="center" w:pos="4680" w:leader="none"/>
-              <w:tab w:val="right" w:pos="9360" w:leader="none"/>
+              <w:tab w:val="center" w:pos="4680"/>
+              <w:tab w:val="right" w:pos="9360"/>
             </w:tabs>
-            <w:spacing w:lineRule="auto" w:line="240" w:before="0" w:after="0"/>
+            <w:spacing w:after="0" w:line="240" w:lineRule="auto"/>
             <w:jc w:val="center"/>
             <w:rPr>
-              <w:rFonts w:ascii="Cambria" w:hAnsi="Cambria" w:eastAsia="Cambria" w:cs="Cambria"/>
+              <w:rFonts w:ascii="Cambria" w:eastAsia="Cambria" w:hAnsi="Cambria" w:cs="Cambria"/>
               <w:b/>
               <w:color w:val="000000"/>
               <w:sz w:val="10"/>
@@ -998,7 +1439,7 @@
           </w:pPr>
           <w:r>
             <w:rPr>
-              <w:rFonts w:eastAsia="Cambria" w:cs="Cambria" w:ascii="Cambria" w:hAnsi="Cambria"/>
+              <w:rFonts w:ascii="Cambria" w:eastAsia="Cambria" w:hAnsi="Cambria" w:cs="Cambria"/>
               <w:b/>
               <w:color w:val="000000"/>
               <w:sz w:val="10"/>
@@ -1013,23 +1454,21 @@
           <w:tcW w:w="1080" w:type="dxa"/>
           <w:tcBorders>
             <w:top w:val="single" w:sz="4" w:space="0" w:color="000000"/>
-            <w:start w:val="single" w:sz="4" w:space="0" w:color="000000"/>
+            <w:left w:val="single" w:sz="4" w:space="0" w:color="000000"/>
             <w:bottom w:val="single" w:sz="4" w:space="0" w:color="000000"/>
-            <w:end w:val="single" w:sz="4" w:space="0" w:color="000000"/>
+            <w:right w:val="single" w:sz="4" w:space="0" w:color="000000"/>
           </w:tcBorders>
         </w:tcPr>
         <w:p>
           <w:pPr>
-            <w:pStyle w:val="Normal"/>
             <w:tabs>
-              <w:tab w:val="clear" w:pos="720"/>
-              <w:tab w:val="center" w:pos="4680" w:leader="none"/>
-              <w:tab w:val="right" w:pos="9360" w:leader="none"/>
+              <w:tab w:val="center" w:pos="4680"/>
+              <w:tab w:val="right" w:pos="9360"/>
             </w:tabs>
-            <w:spacing w:lineRule="auto" w:line="240" w:before="0" w:after="0"/>
+            <w:spacing w:after="0" w:line="240" w:lineRule="auto"/>
             <w:jc w:val="center"/>
             <w:rPr>
-              <w:rFonts w:ascii="Cambria" w:hAnsi="Cambria" w:eastAsia="Cambria" w:cs="Cambria"/>
+              <w:rFonts w:ascii="Cambria" w:eastAsia="Cambria" w:hAnsi="Cambria" w:cs="Cambria"/>
               <w:b/>
               <w:color w:val="000000"/>
               <w:sz w:val="10"/>
@@ -1038,7 +1477,7 @@
           </w:pPr>
           <w:r>
             <w:rPr>
-              <w:rFonts w:eastAsia="Cambria" w:cs="Cambria" w:ascii="Cambria" w:hAnsi="Cambria"/>
+              <w:rFonts w:ascii="Cambria" w:eastAsia="Cambria" w:hAnsi="Cambria" w:cs="Cambria"/>
               <w:b/>
               <w:color w:val="000000"/>
               <w:sz w:val="10"/>
@@ -1050,39 +1489,28 @@
       </w:tc>
     </w:tr>
     <w:tr>
-      <w:trPr/>
       <w:tc>
         <w:tcPr>
           <w:tcW w:w="2159" w:type="dxa"/>
           <w:tcBorders>
-            <w:end w:val="single" w:sz="4" w:space="0" w:color="000000"/>
+            <w:right w:val="single" w:sz="4" w:space="0" w:color="000000"/>
           </w:tcBorders>
         </w:tcPr>
         <w:p>
           <w:pPr>
-            <w:pStyle w:val="Normal"/>
             <w:tabs>
-              <w:tab w:val="clear" w:pos="720"/>
-              <w:tab w:val="center" w:pos="4680" w:leader="none"/>
-              <w:tab w:val="right" w:pos="9360" w:leader="none"/>
+              <w:tab w:val="center" w:pos="4680"/>
+              <w:tab w:val="right" w:pos="9360"/>
             </w:tabs>
-            <w:spacing w:lineRule="auto" w:line="240" w:before="0" w:after="0"/>
+            <w:spacing w:after="0" w:line="240" w:lineRule="auto"/>
             <w:jc w:val="center"/>
             <w:rPr>
-              <w:rFonts w:ascii="Cambria" w:hAnsi="Cambria" w:eastAsia="Cambria" w:cs="Cambria"/>
+              <w:rFonts w:ascii="Cambria" w:eastAsia="Cambria" w:hAnsi="Cambria" w:cs="Cambria"/>
               <w:color w:val="000000"/>
               <w:sz w:val="10"/>
               <w:szCs w:val="10"/>
             </w:rPr>
           </w:pPr>
-          <w:r>
-            <w:rPr>
-              <w:rFonts w:eastAsia="Cambria" w:cs="Cambria" w:ascii="Cambria" w:hAnsi="Cambria"/>
-              <w:color w:val="000000"/>
-              <w:sz w:val="10"/>
-              <w:szCs w:val="10"/>
-            </w:rPr>
-          </w:r>
         </w:p>
       </w:tc>
       <w:tc>
@@ -1090,24 +1518,22 @@
           <w:tcW w:w="1332" w:type="dxa"/>
           <w:tcBorders>
             <w:top w:val="single" w:sz="4" w:space="0" w:color="000000"/>
-            <w:start w:val="single" w:sz="4" w:space="0" w:color="000000"/>
+            <w:left w:val="single" w:sz="4" w:space="0" w:color="000000"/>
             <w:bottom w:val="single" w:sz="4" w:space="0" w:color="000000"/>
-            <w:end w:val="single" w:sz="4" w:space="0" w:color="000000"/>
+            <w:right w:val="single" w:sz="4" w:space="0" w:color="000000"/>
           </w:tcBorders>
-          <w:shd w:color="auto" w:fill="auto" w:val="clear"/>
+          <w:shd w:val="clear" w:color="auto" w:fill="auto"/>
         </w:tcPr>
         <w:p>
           <w:pPr>
-            <w:pStyle w:val="Normal"/>
             <w:tabs>
-              <w:tab w:val="clear" w:pos="720"/>
-              <w:tab w:val="center" w:pos="4680" w:leader="none"/>
-              <w:tab w:val="right" w:pos="9360" w:leader="none"/>
+              <w:tab w:val="center" w:pos="4680"/>
+              <w:tab w:val="right" w:pos="9360"/>
             </w:tabs>
-            <w:spacing w:lineRule="auto" w:line="240" w:before="0" w:after="0"/>
+            <w:spacing w:after="0" w:line="240" w:lineRule="auto"/>
             <w:jc w:val="center"/>
             <w:rPr>
-              <w:rFonts w:ascii="Cambria" w:hAnsi="Cambria" w:eastAsia="Cambria" w:cs="Cambria"/>
+              <w:rFonts w:ascii="Cambria" w:eastAsia="Cambria" w:hAnsi="Cambria" w:cs="Cambria"/>
               <w:color w:val="000000"/>
               <w:sz w:val="10"/>
               <w:szCs w:val="10"/>
@@ -1115,7 +1541,7 @@
           </w:pPr>
           <w:r>
             <w:rPr>
-              <w:rFonts w:eastAsia="Cambria" w:cs="Cambria" w:ascii="Cambria" w:hAnsi="Cambria"/>
+              <w:rFonts w:ascii="Cambria" w:eastAsia="Cambria" w:hAnsi="Cambria" w:cs="Cambria"/>
               <w:color w:val="000000"/>
               <w:sz w:val="10"/>
               <w:szCs w:val="10"/>
@@ -1129,24 +1555,22 @@
           <w:tcW w:w="990" w:type="dxa"/>
           <w:tcBorders>
             <w:top w:val="single" w:sz="4" w:space="0" w:color="000000"/>
-            <w:start w:val="single" w:sz="4" w:space="0" w:color="000000"/>
+            <w:left w:val="single" w:sz="4" w:space="0" w:color="000000"/>
             <w:bottom w:val="single" w:sz="4" w:space="0" w:color="000000"/>
-            <w:end w:val="single" w:sz="4" w:space="0" w:color="000000"/>
+            <w:right w:val="single" w:sz="4" w:space="0" w:color="000000"/>
           </w:tcBorders>
-          <w:shd w:color="auto" w:fill="auto" w:val="clear"/>
+          <w:shd w:val="clear" w:color="auto" w:fill="auto"/>
         </w:tcPr>
         <w:p>
           <w:pPr>
-            <w:pStyle w:val="Normal"/>
             <w:tabs>
-              <w:tab w:val="clear" w:pos="720"/>
-              <w:tab w:val="center" w:pos="4680" w:leader="none"/>
-              <w:tab w:val="right" w:pos="9360" w:leader="none"/>
+              <w:tab w:val="center" w:pos="4680"/>
+              <w:tab w:val="right" w:pos="9360"/>
             </w:tabs>
-            <w:spacing w:lineRule="auto" w:line="240" w:before="0" w:after="0"/>
+            <w:spacing w:after="0" w:line="240" w:lineRule="auto"/>
             <w:jc w:val="center"/>
             <w:rPr>
-              <w:rFonts w:ascii="Cambria" w:hAnsi="Cambria" w:eastAsia="Cambria" w:cs="Cambria"/>
+              <w:rFonts w:ascii="Cambria" w:eastAsia="Cambria" w:hAnsi="Cambria" w:cs="Cambria"/>
               <w:color w:val="000000"/>
               <w:sz w:val="10"/>
               <w:szCs w:val="10"/>
@@ -1154,7 +1578,7 @@
           </w:pPr>
           <w:r>
             <w:rPr>
-              <w:rFonts w:eastAsia="Cambria" w:cs="Cambria" w:ascii="Cambria" w:hAnsi="Cambria"/>
+              <w:rFonts w:ascii="Cambria" w:eastAsia="Cambria" w:hAnsi="Cambria" w:cs="Cambria"/>
               <w:color w:val="000000"/>
               <w:sz w:val="10"/>
               <w:szCs w:val="10"/>
@@ -1168,23 +1592,21 @@
           <w:tcW w:w="1080" w:type="dxa"/>
           <w:tcBorders>
             <w:top w:val="single" w:sz="4" w:space="0" w:color="000000"/>
-            <w:start w:val="single" w:sz="4" w:space="0" w:color="000000"/>
+            <w:left w:val="single" w:sz="4" w:space="0" w:color="000000"/>
             <w:bottom w:val="single" w:sz="4" w:space="0" w:color="000000"/>
-            <w:end w:val="single" w:sz="4" w:space="0" w:color="000000"/>
+            <w:right w:val="single" w:sz="4" w:space="0" w:color="000000"/>
           </w:tcBorders>
         </w:tcPr>
         <w:p>
           <w:pPr>
-            <w:pStyle w:val="Normal"/>
             <w:tabs>
-              <w:tab w:val="clear" w:pos="720"/>
-              <w:tab w:val="center" w:pos="4680" w:leader="none"/>
-              <w:tab w:val="right" w:pos="9360" w:leader="none"/>
+              <w:tab w:val="center" w:pos="4680"/>
+              <w:tab w:val="right" w:pos="9360"/>
             </w:tabs>
-            <w:spacing w:lineRule="auto" w:line="240" w:before="0" w:after="0"/>
+            <w:spacing w:after="0" w:line="240" w:lineRule="auto"/>
             <w:jc w:val="center"/>
             <w:rPr>
-              <w:rFonts w:ascii="Cambria" w:hAnsi="Cambria" w:eastAsia="Cambria" w:cs="Cambria"/>
+              <w:rFonts w:ascii="Cambria" w:eastAsia="Cambria" w:hAnsi="Cambria" w:cs="Cambria"/>
               <w:color w:val="000000"/>
               <w:sz w:val="10"/>
               <w:szCs w:val="10"/>
@@ -1192,7 +1614,7 @@
           </w:pPr>
           <w:r>
             <w:rPr>
-              <w:rFonts w:eastAsia="Cambria" w:cs="Cambria" w:ascii="Cambria" w:hAnsi="Cambria"/>
+              <w:rFonts w:ascii="Cambria" w:eastAsia="Cambria" w:hAnsi="Cambria" w:cs="Cambria"/>
               <w:color w:val="000000"/>
               <w:sz w:val="10"/>
               <w:szCs w:val="10"/>
@@ -1205,61 +1627,37 @@
   </w:tbl>
   <w:p>
     <w:pPr>
-      <w:pStyle w:val="Normal"/>
       <w:tabs>
-        <w:tab w:val="clear" w:pos="720"/>
-        <w:tab w:val="center" w:pos="4680" w:leader="none"/>
-        <w:tab w:val="right" w:pos="9360" w:leader="none"/>
+        <w:tab w:val="center" w:pos="4680"/>
+        <w:tab w:val="right" w:pos="9360"/>
       </w:tabs>
-      <w:spacing w:before="0" w:after="200"/>
       <w:rPr>
         <w:color w:val="000000"/>
         <w:sz w:val="2"/>
         <w:szCs w:val="2"/>
       </w:rPr>
     </w:pPr>
-    <w:r>
-      <w:rPr>
-        <w:color w:val="000000"/>
-        <w:sz w:val="2"/>
-        <w:szCs w:val="2"/>
-      </w:rPr>
-    </w:r>
   </w:p>
 </w:ftr>
 </file>
 
-<file path=word/footer3.xml><?xml version="1.0" encoding="utf-8"?>
-<w:ftr xmlns:o="urn:schemas-microsoft-com:office:office" xmlns:r="http://schemas.openxmlformats.org/officeDocument/2006/relationships" xmlns:v="urn:schemas-microsoft-com:vml" xmlns:w="http://schemas.openxmlformats.org/wordprocessingml/2006/main" xmlns:w10="urn:schemas-microsoft-com:office:word" xmlns:wp="http://schemas.openxmlformats.org/drawingml/2006/wordprocessingDrawing" xmlns:wps="http://schemas.microsoft.com/office/word/2010/wordprocessingShape" xmlns:wpg="http://schemas.microsoft.com/office/word/2010/wordprocessingGroup" xmlns:mc="http://schemas.openxmlformats.org/markup-compatibility/2006" xmlns:wp14="http://schemas.microsoft.com/office/word/2010/wordprocessingDrawing" xmlns:w14="http://schemas.microsoft.com/office/word/2010/wordml" xmlns:w15="http://schemas.microsoft.com/office/word/2012/wordml" mc:Ignorable="w14 wp14 w15">
+<file path=word/footer2.xml><?xml version="1.0" encoding="utf-8"?>
+<w:ftr xmlns:wpc="http://schemas.microsoft.com/office/word/2010/wordprocessingCanvas" xmlns:cx="http://schemas.microsoft.com/office/drawing/2014/chartex" xmlns:mc="http://schemas.openxmlformats.org/markup-compatibility/2006" xmlns:o="urn:schemas-microsoft-com:office:office" xmlns:r="http://schemas.openxmlformats.org/officeDocument/2006/relationships" xmlns:m="http://schemas.openxmlformats.org/officeDocument/2006/math" xmlns:v="urn:schemas-microsoft-com:vml" xmlns:wp14="http://schemas.microsoft.com/office/word/2010/wordprocessingDrawing" xmlns:wp="http://schemas.openxmlformats.org/drawingml/2006/wordprocessingDrawing" xmlns:w10="urn:schemas-microsoft-com:office:word" xmlns:w="http://schemas.openxmlformats.org/wordprocessingml/2006/main" xmlns:w14="http://schemas.microsoft.com/office/word/2010/wordml" xmlns:w15="http://schemas.microsoft.com/office/word/2012/wordml" xmlns:w16se="http://schemas.microsoft.com/office/word/2015/wordml/symex" xmlns:wpg="http://schemas.microsoft.com/office/word/2010/wordprocessingGroup" xmlns:wpi="http://schemas.microsoft.com/office/word/2010/wordprocessingInk" xmlns:wne="http://schemas.microsoft.com/office/word/2006/wordml" xmlns:wps="http://schemas.microsoft.com/office/word/2010/wordprocessingShape" mc:Ignorable="w14 w15 w16se wp14">
   <w:p>
     <w:pPr>
-      <w:pStyle w:val="Normal"/>
-      <w:widowControl w:val="false"/>
-      <w:spacing w:before="0" w:after="0"/>
+      <w:widowControl w:val="0"/>
+      <w:spacing w:after="0"/>
       <w:rPr>
         <w:color w:val="000000"/>
       </w:rPr>
     </w:pPr>
-    <w:r>
-      <w:rPr>
-        <w:color w:val="000000"/>
-      </w:rPr>
-    </w:r>
   </w:p>
   <w:tbl>
     <w:tblPr>
-      <w:tblStyle w:val="a0"/>
       <w:tblW w:w="5562" w:type="dxa"/>
-      <w:jc w:val="start"/>
       <w:tblInd w:w="108" w:type="dxa"/>
       <w:tblLayout w:type="fixed"/>
-      <w:tblCellMar>
-        <w:top w:w="0" w:type="dxa"/>
-        <w:start w:w="108" w:type="dxa"/>
-        <w:bottom w:w="0" w:type="dxa"/>
-        <w:end w:w="108" w:type="dxa"/>
-      </w:tblCellMar>
-      <w:tblLook w:firstRow="0" w:noVBand="1" w:lastRow="0" w:firstColumn="0" w:lastColumn="0" w:noHBand="0" w:val="0400"/>
+      <w:tblLook w:val="0400" w:firstRow="0" w:lastRow="0" w:firstColumn="0" w:lastColumn="0" w:noHBand="0" w:noVBand="1"/>
     </w:tblPr>
     <w:tblGrid>
       <w:gridCol w:w="2159"/>
@@ -1268,7 +1666,6 @@
       <w:gridCol w:w="1080"/>
     </w:tblGrid>
     <w:tr>
-      <w:trPr/>
       <w:tc>
         <w:tcPr>
           <w:tcW w:w="2159" w:type="dxa"/>
@@ -1278,31 +1675,20 @@
         </w:tcPr>
         <w:p>
           <w:pPr>
-            <w:pStyle w:val="Normal"/>
             <w:tabs>
-              <w:tab w:val="clear" w:pos="720"/>
-              <w:tab w:val="center" w:pos="4680" w:leader="none"/>
-              <w:tab w:val="right" w:pos="9360" w:leader="none"/>
+              <w:tab w:val="center" w:pos="4680"/>
+              <w:tab w:val="right" w:pos="9360"/>
             </w:tabs>
-            <w:spacing w:lineRule="auto" w:line="240" w:before="0" w:after="0"/>
+            <w:spacing w:after="0" w:line="240" w:lineRule="auto"/>
             <w:jc w:val="center"/>
             <w:rPr>
-              <w:rFonts w:ascii="Cambria" w:hAnsi="Cambria" w:eastAsia="Cambria" w:cs="Cambria"/>
+              <w:rFonts w:ascii="Cambria" w:eastAsia="Cambria" w:hAnsi="Cambria" w:cs="Cambria"/>
               <w:b/>
               <w:color w:val="000000"/>
               <w:sz w:val="6"/>
               <w:szCs w:val="6"/>
             </w:rPr>
           </w:pPr>
-          <w:r>
-            <w:rPr>
-              <w:rFonts w:eastAsia="Cambria" w:cs="Cambria" w:ascii="Cambria" w:hAnsi="Cambria"/>
-              <w:b/>
-              <w:color w:val="000000"/>
-              <w:sz w:val="6"/>
-              <w:szCs w:val="6"/>
-            </w:rPr>
-          </w:r>
         </w:p>
       </w:tc>
       <w:tc>
@@ -1312,35 +1698,24 @@
             <w:top w:val="single" w:sz="24" w:space="0" w:color="800000"/>
             <w:bottom w:val="single" w:sz="4" w:space="0" w:color="000000"/>
           </w:tcBorders>
-          <w:shd w:color="auto" w:fill="auto" w:val="clear"/>
+          <w:shd w:val="clear" w:color="auto" w:fill="auto"/>
         </w:tcPr>
         <w:p>
           <w:pPr>
-            <w:pStyle w:val="Normal"/>
             <w:tabs>
-              <w:tab w:val="clear" w:pos="720"/>
-              <w:tab w:val="center" w:pos="4680" w:leader="none"/>
-              <w:tab w:val="right" w:pos="9360" w:leader="none"/>
+              <w:tab w:val="center" w:pos="4680"/>
+              <w:tab w:val="right" w:pos="9360"/>
             </w:tabs>
-            <w:spacing w:lineRule="auto" w:line="240" w:before="0" w:after="0"/>
+            <w:spacing w:after="0" w:line="240" w:lineRule="auto"/>
             <w:jc w:val="center"/>
             <w:rPr>
-              <w:rFonts w:ascii="Cambria" w:hAnsi="Cambria" w:eastAsia="Cambria" w:cs="Cambria"/>
+              <w:rFonts w:ascii="Cambria" w:eastAsia="Cambria" w:hAnsi="Cambria" w:cs="Cambria"/>
               <w:b/>
               <w:color w:val="000000"/>
               <w:sz w:val="6"/>
               <w:szCs w:val="6"/>
             </w:rPr>
           </w:pPr>
-          <w:r>
-            <w:rPr>
-              <w:rFonts w:eastAsia="Cambria" w:cs="Cambria" w:ascii="Cambria" w:hAnsi="Cambria"/>
-              <w:b/>
-              <w:color w:val="000000"/>
-              <w:sz w:val="6"/>
-              <w:szCs w:val="6"/>
-            </w:rPr>
-          </w:r>
         </w:p>
       </w:tc>
       <w:tc>
@@ -1350,35 +1725,24 @@
             <w:top w:val="single" w:sz="24" w:space="0" w:color="800000"/>
             <w:bottom w:val="single" w:sz="4" w:space="0" w:color="000000"/>
           </w:tcBorders>
-          <w:shd w:color="auto" w:fill="auto" w:val="clear"/>
+          <w:shd w:val="clear" w:color="auto" w:fill="auto"/>
         </w:tcPr>
         <w:p>
           <w:pPr>
-            <w:pStyle w:val="Normal"/>
             <w:tabs>
-              <w:tab w:val="clear" w:pos="720"/>
-              <w:tab w:val="center" w:pos="4680" w:leader="none"/>
-              <w:tab w:val="right" w:pos="9360" w:leader="none"/>
+              <w:tab w:val="center" w:pos="4680"/>
+              <w:tab w:val="right" w:pos="9360"/>
             </w:tabs>
-            <w:spacing w:lineRule="auto" w:line="240" w:before="0" w:after="0"/>
+            <w:spacing w:after="0" w:line="240" w:lineRule="auto"/>
             <w:jc w:val="center"/>
             <w:rPr>
-              <w:rFonts w:ascii="Cambria" w:hAnsi="Cambria" w:eastAsia="Cambria" w:cs="Cambria"/>
+              <w:rFonts w:ascii="Cambria" w:eastAsia="Cambria" w:hAnsi="Cambria" w:cs="Cambria"/>
               <w:b/>
               <w:color w:val="000000"/>
               <w:sz w:val="6"/>
               <w:szCs w:val="6"/>
             </w:rPr>
           </w:pPr>
-          <w:r>
-            <w:rPr>
-              <w:rFonts w:eastAsia="Cambria" w:cs="Cambria" w:ascii="Cambria" w:hAnsi="Cambria"/>
-              <w:b/>
-              <w:color w:val="000000"/>
-              <w:sz w:val="6"/>
-              <w:szCs w:val="6"/>
-            </w:rPr>
-          </w:r>
         </w:p>
       </w:tc>
       <w:tc>
@@ -1391,72 +1755,50 @@
         </w:tcPr>
         <w:p>
           <w:pPr>
-            <w:pStyle w:val="Normal"/>
             <w:tabs>
-              <w:tab w:val="clear" w:pos="720"/>
-              <w:tab w:val="center" w:pos="4680" w:leader="none"/>
-              <w:tab w:val="right" w:pos="9360" w:leader="none"/>
+              <w:tab w:val="center" w:pos="4680"/>
+              <w:tab w:val="right" w:pos="9360"/>
             </w:tabs>
-            <w:spacing w:lineRule="auto" w:line="240" w:before="0" w:after="0"/>
+            <w:spacing w:after="0" w:line="240" w:lineRule="auto"/>
             <w:jc w:val="center"/>
             <w:rPr>
-              <w:rFonts w:ascii="Cambria" w:hAnsi="Cambria" w:eastAsia="Cambria" w:cs="Cambria"/>
+              <w:rFonts w:ascii="Cambria" w:eastAsia="Cambria" w:hAnsi="Cambria" w:cs="Cambria"/>
               <w:b/>
               <w:color w:val="000000"/>
               <w:sz w:val="6"/>
               <w:szCs w:val="6"/>
             </w:rPr>
           </w:pPr>
-          <w:r>
-            <w:rPr>
-              <w:rFonts w:eastAsia="Cambria" w:cs="Cambria" w:ascii="Cambria" w:hAnsi="Cambria"/>
-              <w:b/>
-              <w:color w:val="000000"/>
-              <w:sz w:val="6"/>
-              <w:szCs w:val="6"/>
-            </w:rPr>
-          </w:r>
         </w:p>
       </w:tc>
     </w:tr>
     <w:tr>
       <w:trPr>
-        <w:trHeight w:val="146" w:hRule="atLeast"/>
+        <w:trHeight w:val="146"/>
       </w:trPr>
       <w:tc>
         <w:tcPr>
           <w:tcW w:w="2159" w:type="dxa"/>
           <w:tcBorders>
-            <w:end w:val="single" w:sz="4" w:space="0" w:color="000000"/>
+            <w:right w:val="single" w:sz="4" w:space="0" w:color="000000"/>
           </w:tcBorders>
         </w:tcPr>
         <w:p>
           <w:pPr>
-            <w:pStyle w:val="Normal"/>
             <w:tabs>
-              <w:tab w:val="clear" w:pos="720"/>
-              <w:tab w:val="center" w:pos="4680" w:leader="none"/>
-              <w:tab w:val="right" w:pos="9360" w:leader="none"/>
+              <w:tab w:val="center" w:pos="4680"/>
+              <w:tab w:val="right" w:pos="9360"/>
             </w:tabs>
-            <w:spacing w:lineRule="auto" w:line="240" w:before="0" w:after="0"/>
+            <w:spacing w:after="0" w:line="240" w:lineRule="auto"/>
             <w:jc w:val="center"/>
             <w:rPr>
-              <w:rFonts w:ascii="Cambria" w:hAnsi="Cambria" w:eastAsia="Cambria" w:cs="Cambria"/>
+              <w:rFonts w:ascii="Cambria" w:eastAsia="Cambria" w:hAnsi="Cambria" w:cs="Cambria"/>
               <w:b/>
               <w:color w:val="000000"/>
               <w:sz w:val="10"/>
               <w:szCs w:val="10"/>
             </w:rPr>
           </w:pPr>
-          <w:r>
-            <w:rPr>
-              <w:rFonts w:eastAsia="Cambria" w:cs="Cambria" w:ascii="Cambria" w:hAnsi="Cambria"/>
-              <w:b/>
-              <w:color w:val="000000"/>
-              <w:sz w:val="10"/>
-              <w:szCs w:val="10"/>
-            </w:rPr>
-          </w:r>
         </w:p>
       </w:tc>
       <w:tc>
@@ -1464,24 +1806,22 @@
           <w:tcW w:w="1332" w:type="dxa"/>
           <w:tcBorders>
             <w:top w:val="single" w:sz="4" w:space="0" w:color="000000"/>
-            <w:start w:val="single" w:sz="4" w:space="0" w:color="000000"/>
+            <w:left w:val="single" w:sz="4" w:space="0" w:color="000000"/>
             <w:bottom w:val="single" w:sz="4" w:space="0" w:color="000000"/>
-            <w:end w:val="single" w:sz="4" w:space="0" w:color="000000"/>
+            <w:right w:val="single" w:sz="4" w:space="0" w:color="000000"/>
           </w:tcBorders>
-          <w:shd w:color="auto" w:fill="auto" w:val="clear"/>
+          <w:shd w:val="clear" w:color="auto" w:fill="auto"/>
         </w:tcPr>
         <w:p>
           <w:pPr>
-            <w:pStyle w:val="Normal"/>
             <w:tabs>
-              <w:tab w:val="clear" w:pos="720"/>
-              <w:tab w:val="center" w:pos="4680" w:leader="none"/>
-              <w:tab w:val="right" w:pos="9360" w:leader="none"/>
+              <w:tab w:val="center" w:pos="4680"/>
+              <w:tab w:val="right" w:pos="9360"/>
             </w:tabs>
-            <w:spacing w:lineRule="auto" w:line="240" w:before="0" w:after="0"/>
+            <w:spacing w:after="0" w:line="240" w:lineRule="auto"/>
             <w:jc w:val="center"/>
             <w:rPr>
-              <w:rFonts w:ascii="Cambria" w:hAnsi="Cambria" w:eastAsia="Cambria" w:cs="Cambria"/>
+              <w:rFonts w:ascii="Cambria" w:eastAsia="Cambria" w:hAnsi="Cambria" w:cs="Cambria"/>
               <w:b/>
               <w:color w:val="000000"/>
               <w:sz w:val="10"/>
@@ -1490,7 +1830,7 @@
           </w:pPr>
           <w:r>
             <w:rPr>
-              <w:rFonts w:eastAsia="Cambria" w:cs="Cambria" w:ascii="Cambria" w:hAnsi="Cambria"/>
+              <w:rFonts w:ascii="Cambria" w:eastAsia="Cambria" w:hAnsi="Cambria" w:cs="Cambria"/>
               <w:b/>
               <w:color w:val="000000"/>
               <w:sz w:val="10"/>
@@ -1505,24 +1845,22 @@
           <w:tcW w:w="990" w:type="dxa"/>
           <w:tcBorders>
             <w:top w:val="single" w:sz="4" w:space="0" w:color="000000"/>
-            <w:start w:val="single" w:sz="4" w:space="0" w:color="000000"/>
+            <w:left w:val="single" w:sz="4" w:space="0" w:color="000000"/>
             <w:bottom w:val="single" w:sz="4" w:space="0" w:color="000000"/>
-            <w:end w:val="single" w:sz="4" w:space="0" w:color="000000"/>
+            <w:right w:val="single" w:sz="4" w:space="0" w:color="000000"/>
           </w:tcBorders>
-          <w:shd w:color="auto" w:fill="auto" w:val="clear"/>
+          <w:shd w:val="clear" w:color="auto" w:fill="auto"/>
         </w:tcPr>
         <w:p>
           <w:pPr>
-            <w:pStyle w:val="Normal"/>
             <w:tabs>
-              <w:tab w:val="clear" w:pos="720"/>
-              <w:tab w:val="center" w:pos="4680" w:leader="none"/>
-              <w:tab w:val="right" w:pos="9360" w:leader="none"/>
+              <w:tab w:val="center" w:pos="4680"/>
+              <w:tab w:val="right" w:pos="9360"/>
             </w:tabs>
-            <w:spacing w:lineRule="auto" w:line="240" w:before="0" w:after="0"/>
+            <w:spacing w:after="0" w:line="240" w:lineRule="auto"/>
             <w:jc w:val="center"/>
             <w:rPr>
-              <w:rFonts w:ascii="Cambria" w:hAnsi="Cambria" w:eastAsia="Cambria" w:cs="Cambria"/>
+              <w:rFonts w:ascii="Cambria" w:eastAsia="Cambria" w:hAnsi="Cambria" w:cs="Cambria"/>
               <w:b/>
               <w:color w:val="000000"/>
               <w:sz w:val="10"/>
@@ -1531,7 +1869,7 @@
           </w:pPr>
           <w:r>
             <w:rPr>
-              <w:rFonts w:eastAsia="Cambria" w:cs="Cambria" w:ascii="Cambria" w:hAnsi="Cambria"/>
+              <w:rFonts w:ascii="Cambria" w:eastAsia="Cambria" w:hAnsi="Cambria" w:cs="Cambria"/>
               <w:b/>
               <w:color w:val="000000"/>
               <w:sz w:val="10"/>
@@ -1546,23 +1884,21 @@
           <w:tcW w:w="1080" w:type="dxa"/>
           <w:tcBorders>
             <w:top w:val="single" w:sz="4" w:space="0" w:color="000000"/>
-            <w:start w:val="single" w:sz="4" w:space="0" w:color="000000"/>
+            <w:left w:val="single" w:sz="4" w:space="0" w:color="000000"/>
             <w:bottom w:val="single" w:sz="4" w:space="0" w:color="000000"/>
-            <w:end w:val="single" w:sz="4" w:space="0" w:color="000000"/>
+            <w:right w:val="single" w:sz="4" w:space="0" w:color="000000"/>
           </w:tcBorders>
         </w:tcPr>
         <w:p>
           <w:pPr>
-            <w:pStyle w:val="Normal"/>
             <w:tabs>
-              <w:tab w:val="clear" w:pos="720"/>
-              <w:tab w:val="center" w:pos="4680" w:leader="none"/>
-              <w:tab w:val="right" w:pos="9360" w:leader="none"/>
+              <w:tab w:val="center" w:pos="4680"/>
+              <w:tab w:val="right" w:pos="9360"/>
             </w:tabs>
-            <w:spacing w:lineRule="auto" w:line="240" w:before="0" w:after="0"/>
+            <w:spacing w:after="0" w:line="240" w:lineRule="auto"/>
             <w:jc w:val="center"/>
             <w:rPr>
-              <w:rFonts w:ascii="Cambria" w:hAnsi="Cambria" w:eastAsia="Cambria" w:cs="Cambria"/>
+              <w:rFonts w:ascii="Cambria" w:eastAsia="Cambria" w:hAnsi="Cambria" w:cs="Cambria"/>
               <w:b/>
               <w:color w:val="000000"/>
               <w:sz w:val="10"/>
@@ -1571,7 +1907,7 @@
           </w:pPr>
           <w:r>
             <w:rPr>
-              <w:rFonts w:eastAsia="Cambria" w:cs="Cambria" w:ascii="Cambria" w:hAnsi="Cambria"/>
+              <w:rFonts w:ascii="Cambria" w:eastAsia="Cambria" w:hAnsi="Cambria" w:cs="Cambria"/>
               <w:b/>
               <w:color w:val="000000"/>
               <w:sz w:val="10"/>
@@ -1583,39 +1919,28 @@
       </w:tc>
     </w:tr>
     <w:tr>
-      <w:trPr/>
       <w:tc>
         <w:tcPr>
           <w:tcW w:w="2159" w:type="dxa"/>
           <w:tcBorders>
-            <w:end w:val="single" w:sz="4" w:space="0" w:color="000000"/>
+            <w:right w:val="single" w:sz="4" w:space="0" w:color="000000"/>
           </w:tcBorders>
         </w:tcPr>
         <w:p>
           <w:pPr>
-            <w:pStyle w:val="Normal"/>
             <w:tabs>
-              <w:tab w:val="clear" w:pos="720"/>
-              <w:tab w:val="center" w:pos="4680" w:leader="none"/>
-              <w:tab w:val="right" w:pos="9360" w:leader="none"/>
+              <w:tab w:val="center" w:pos="4680"/>
+              <w:tab w:val="right" w:pos="9360"/>
             </w:tabs>
-            <w:spacing w:lineRule="auto" w:line="240" w:before="0" w:after="0"/>
+            <w:spacing w:after="0" w:line="240" w:lineRule="auto"/>
             <w:jc w:val="center"/>
             <w:rPr>
-              <w:rFonts w:ascii="Cambria" w:hAnsi="Cambria" w:eastAsia="Cambria" w:cs="Cambria"/>
+              <w:rFonts w:ascii="Cambria" w:eastAsia="Cambria" w:hAnsi="Cambria" w:cs="Cambria"/>
               <w:color w:val="000000"/>
               <w:sz w:val="10"/>
               <w:szCs w:val="10"/>
             </w:rPr>
           </w:pPr>
-          <w:r>
-            <w:rPr>
-              <w:rFonts w:eastAsia="Cambria" w:cs="Cambria" w:ascii="Cambria" w:hAnsi="Cambria"/>
-              <w:color w:val="000000"/>
-              <w:sz w:val="10"/>
-              <w:szCs w:val="10"/>
-            </w:rPr>
-          </w:r>
         </w:p>
       </w:tc>
       <w:tc>
@@ -1623,24 +1948,22 @@
           <w:tcW w:w="1332" w:type="dxa"/>
           <w:tcBorders>
             <w:top w:val="single" w:sz="4" w:space="0" w:color="000000"/>
-            <w:start w:val="single" w:sz="4" w:space="0" w:color="000000"/>
+            <w:left w:val="single" w:sz="4" w:space="0" w:color="000000"/>
             <w:bottom w:val="single" w:sz="4" w:space="0" w:color="000000"/>
-            <w:end w:val="single" w:sz="4" w:space="0" w:color="000000"/>
+            <w:right w:val="single" w:sz="4" w:space="0" w:color="000000"/>
           </w:tcBorders>
-          <w:shd w:color="auto" w:fill="auto" w:val="clear"/>
+          <w:shd w:val="clear" w:color="auto" w:fill="auto"/>
         </w:tcPr>
         <w:p>
           <w:pPr>
-            <w:pStyle w:val="Normal"/>
             <w:tabs>
-              <w:tab w:val="clear" w:pos="720"/>
-              <w:tab w:val="center" w:pos="4680" w:leader="none"/>
-              <w:tab w:val="right" w:pos="9360" w:leader="none"/>
+              <w:tab w:val="center" w:pos="4680"/>
+              <w:tab w:val="right" w:pos="9360"/>
             </w:tabs>
-            <w:spacing w:lineRule="auto" w:line="240" w:before="0" w:after="0"/>
+            <w:spacing w:after="0" w:line="240" w:lineRule="auto"/>
             <w:jc w:val="center"/>
             <w:rPr>
-              <w:rFonts w:ascii="Cambria" w:hAnsi="Cambria" w:eastAsia="Cambria" w:cs="Cambria"/>
+              <w:rFonts w:ascii="Cambria" w:eastAsia="Cambria" w:hAnsi="Cambria" w:cs="Cambria"/>
               <w:color w:val="000000"/>
               <w:sz w:val="10"/>
               <w:szCs w:val="10"/>
@@ -1648,7 +1971,7 @@
           </w:pPr>
           <w:r>
             <w:rPr>
-              <w:rFonts w:eastAsia="Cambria" w:cs="Cambria" w:ascii="Cambria" w:hAnsi="Cambria"/>
+              <w:rFonts w:ascii="Cambria" w:eastAsia="Cambria" w:hAnsi="Cambria" w:cs="Cambria"/>
               <w:color w:val="000000"/>
               <w:sz w:val="10"/>
               <w:szCs w:val="10"/>
@@ -1662,24 +1985,22 @@
           <w:tcW w:w="990" w:type="dxa"/>
           <w:tcBorders>
             <w:top w:val="single" w:sz="4" w:space="0" w:color="000000"/>
-            <w:start w:val="single" w:sz="4" w:space="0" w:color="000000"/>
+            <w:left w:val="single" w:sz="4" w:space="0" w:color="000000"/>
             <w:bottom w:val="single" w:sz="4" w:space="0" w:color="000000"/>
-            <w:end w:val="single" w:sz="4" w:space="0" w:color="000000"/>
+            <w:right w:val="single" w:sz="4" w:space="0" w:color="000000"/>
           </w:tcBorders>
-          <w:shd w:color="auto" w:fill="auto" w:val="clear"/>
+          <w:shd w:val="clear" w:color="auto" w:fill="auto"/>
         </w:tcPr>
         <w:p>
           <w:pPr>
-            <w:pStyle w:val="Normal"/>
             <w:tabs>
-              <w:tab w:val="clear" w:pos="720"/>
-              <w:tab w:val="center" w:pos="4680" w:leader="none"/>
-              <w:tab w:val="right" w:pos="9360" w:leader="none"/>
+              <w:tab w:val="center" w:pos="4680"/>
+              <w:tab w:val="right" w:pos="9360"/>
             </w:tabs>
-            <w:spacing w:lineRule="auto" w:line="240" w:before="0" w:after="0"/>
+            <w:spacing w:after="0" w:line="240" w:lineRule="auto"/>
             <w:jc w:val="center"/>
             <w:rPr>
-              <w:rFonts w:ascii="Cambria" w:hAnsi="Cambria" w:eastAsia="Cambria" w:cs="Cambria"/>
+              <w:rFonts w:ascii="Cambria" w:eastAsia="Cambria" w:hAnsi="Cambria" w:cs="Cambria"/>
               <w:color w:val="000000"/>
               <w:sz w:val="10"/>
               <w:szCs w:val="10"/>
@@ -1687,7 +2008,7 @@
           </w:pPr>
           <w:r>
             <w:rPr>
-              <w:rFonts w:eastAsia="Cambria" w:cs="Cambria" w:ascii="Cambria" w:hAnsi="Cambria"/>
+              <w:rFonts w:ascii="Cambria" w:eastAsia="Cambria" w:hAnsi="Cambria" w:cs="Cambria"/>
               <w:color w:val="000000"/>
               <w:sz w:val="10"/>
               <w:szCs w:val="10"/>
@@ -1701,23 +2022,21 @@
           <w:tcW w:w="1080" w:type="dxa"/>
           <w:tcBorders>
             <w:top w:val="single" w:sz="4" w:space="0" w:color="000000"/>
-            <w:start w:val="single" w:sz="4" w:space="0" w:color="000000"/>
+            <w:left w:val="single" w:sz="4" w:space="0" w:color="000000"/>
             <w:bottom w:val="single" w:sz="4" w:space="0" w:color="000000"/>
-            <w:end w:val="single" w:sz="4" w:space="0" w:color="000000"/>
+            <w:right w:val="single" w:sz="4" w:space="0" w:color="000000"/>
           </w:tcBorders>
         </w:tcPr>
         <w:p>
           <w:pPr>
-            <w:pStyle w:val="Normal"/>
             <w:tabs>
-              <w:tab w:val="clear" w:pos="720"/>
-              <w:tab w:val="center" w:pos="4680" w:leader="none"/>
-              <w:tab w:val="right" w:pos="9360" w:leader="none"/>
+              <w:tab w:val="center" w:pos="4680"/>
+              <w:tab w:val="right" w:pos="9360"/>
             </w:tabs>
-            <w:spacing w:lineRule="auto" w:line="240" w:before="0" w:after="0"/>
+            <w:spacing w:after="0" w:line="240" w:lineRule="auto"/>
             <w:jc w:val="center"/>
             <w:rPr>
-              <w:rFonts w:ascii="Cambria" w:hAnsi="Cambria" w:eastAsia="Cambria" w:cs="Cambria"/>
+              <w:rFonts w:ascii="Cambria" w:eastAsia="Cambria" w:hAnsi="Cambria" w:cs="Cambria"/>
               <w:color w:val="000000"/>
               <w:sz w:val="10"/>
               <w:szCs w:val="10"/>
@@ -1725,7 +2044,7 @@
           </w:pPr>
           <w:r>
             <w:rPr>
-              <w:rFonts w:eastAsia="Cambria" w:cs="Cambria" w:ascii="Cambria" w:hAnsi="Cambria"/>
+              <w:rFonts w:ascii="Cambria" w:eastAsia="Cambria" w:hAnsi="Cambria" w:cs="Cambria"/>
               <w:color w:val="000000"/>
               <w:sz w:val="10"/>
               <w:szCs w:val="10"/>
@@ -1738,67 +2057,68 @@
   </w:tbl>
   <w:p>
     <w:pPr>
-      <w:pStyle w:val="Normal"/>
       <w:tabs>
-        <w:tab w:val="clear" w:pos="720"/>
-        <w:tab w:val="center" w:pos="4680" w:leader="none"/>
-        <w:tab w:val="right" w:pos="9360" w:leader="none"/>
+        <w:tab w:val="center" w:pos="4680"/>
+        <w:tab w:val="right" w:pos="9360"/>
       </w:tabs>
-      <w:spacing w:before="0" w:after="200"/>
       <w:rPr>
         <w:color w:val="000000"/>
         <w:sz w:val="2"/>
         <w:szCs w:val="2"/>
       </w:rPr>
     </w:pPr>
-    <w:r>
-      <w:rPr>
-        <w:color w:val="000000"/>
-        <w:sz w:val="2"/>
-        <w:szCs w:val="2"/>
-      </w:rPr>
-    </w:r>
   </w:p>
 </w:ftr>
 </file>
 
+<file path=word/footnotes.xml><?xml version="1.0" encoding="utf-8"?>
+<w:footnotes xmlns:wpc="http://schemas.microsoft.com/office/word/2010/wordprocessingCanvas" xmlns:cx="http://schemas.microsoft.com/office/drawing/2014/chartex" xmlns:mc="http://schemas.openxmlformats.org/markup-compatibility/2006" xmlns:o="urn:schemas-microsoft-com:office:office" xmlns:r="http://schemas.openxmlformats.org/officeDocument/2006/relationships" xmlns:m="http://schemas.openxmlformats.org/officeDocument/2006/math" xmlns:v="urn:schemas-microsoft-com:vml" xmlns:wp14="http://schemas.microsoft.com/office/word/2010/wordprocessingDrawing" xmlns:wp="http://schemas.openxmlformats.org/drawingml/2006/wordprocessingDrawing" xmlns:w10="urn:schemas-microsoft-com:office:word" xmlns:w="http://schemas.openxmlformats.org/wordprocessingml/2006/main" xmlns:w14="http://schemas.microsoft.com/office/word/2010/wordml" xmlns:w15="http://schemas.microsoft.com/office/word/2012/wordml" xmlns:w16se="http://schemas.microsoft.com/office/word/2015/wordml/symex" xmlns:wpg="http://schemas.microsoft.com/office/word/2010/wordprocessingGroup" xmlns:wpi="http://schemas.microsoft.com/office/word/2010/wordprocessingInk" xmlns:wne="http://schemas.microsoft.com/office/word/2006/wordml" xmlns:wps="http://schemas.microsoft.com/office/word/2010/wordprocessingShape" mc:Ignorable="w14 w15 w16se wp14">
+  <w:footnote w:type="separator" w:id="-1">
+    <w:p>
+      <w:pPr>
+        <w:spacing w:after="0" w:line="240" w:lineRule="auto"/>
+      </w:pPr>
+      <w:r>
+        <w:separator/>
+      </w:r>
+    </w:p>
+  </w:footnote>
+  <w:footnote w:type="continuationSeparator" w:id="0">
+    <w:p>
+      <w:pPr>
+        <w:spacing w:after="0" w:line="240" w:lineRule="auto"/>
+      </w:pPr>
+      <w:r>
+        <w:continuationSeparator/>
+      </w:r>
+    </w:p>
+  </w:footnote>
+</w:footnotes>
+</file>
+
 <file path=word/header1.xml><?xml version="1.0" encoding="utf-8"?>
-<w:hdr xmlns:o="urn:schemas-microsoft-com:office:office" xmlns:r="http://schemas.openxmlformats.org/officeDocument/2006/relationships" xmlns:v="urn:schemas-microsoft-com:vml" xmlns:w="http://schemas.openxmlformats.org/wordprocessingml/2006/main" xmlns:w10="urn:schemas-microsoft-com:office:word" xmlns:wp="http://schemas.openxmlformats.org/drawingml/2006/wordprocessingDrawing" xmlns:wps="http://schemas.microsoft.com/office/word/2010/wordprocessingShape" xmlns:wpg="http://schemas.microsoft.com/office/word/2010/wordprocessingGroup" xmlns:mc="http://schemas.openxmlformats.org/markup-compatibility/2006" xmlns:wp14="http://schemas.microsoft.com/office/word/2010/wordprocessingDrawing" xmlns:w14="http://schemas.microsoft.com/office/word/2010/wordml" xmlns:w15="http://schemas.microsoft.com/office/word/2012/wordml" mc:Ignorable="w14 wp14 w15">
+<w:hdr xmlns:wpc="http://schemas.microsoft.com/office/word/2010/wordprocessingCanvas" xmlns:cx="http://schemas.microsoft.com/office/drawing/2014/chartex" xmlns:mc="http://schemas.openxmlformats.org/markup-compatibility/2006" xmlns:o="urn:schemas-microsoft-com:office:office" xmlns:r="http://schemas.openxmlformats.org/officeDocument/2006/relationships" xmlns:m="http://schemas.openxmlformats.org/officeDocument/2006/math" xmlns:v="urn:schemas-microsoft-com:vml" xmlns:wp14="http://schemas.microsoft.com/office/word/2010/wordprocessingDrawing" xmlns:wp="http://schemas.openxmlformats.org/drawingml/2006/wordprocessingDrawing" xmlns:w10="urn:schemas-microsoft-com:office:word" xmlns:w="http://schemas.openxmlformats.org/wordprocessingml/2006/main" xmlns:w14="http://schemas.microsoft.com/office/word/2010/wordml" xmlns:w15="http://schemas.microsoft.com/office/word/2012/wordml" xmlns:w16se="http://schemas.microsoft.com/office/word/2015/wordml/symex" xmlns:wpg="http://schemas.microsoft.com/office/word/2010/wordprocessingGroup" xmlns:wpi="http://schemas.microsoft.com/office/word/2010/wordprocessingInk" xmlns:wne="http://schemas.microsoft.com/office/word/2006/wordml" xmlns:wps="http://schemas.microsoft.com/office/word/2010/wordprocessingShape" mc:Ignorable="w14 w15 w16se wp14">
   <w:p>
     <w:pPr>
-      <w:pStyle w:val="Normal"/>
-      <w:spacing w:before="0" w:after="200"/>
-      <w:rPr/>
-    </w:pPr>
-    <w:r>
-      <w:rPr/>
-    </w:r>
-  </w:p>
-</w:hdr>
-</file>
-
-<file path=word/header2.xml><?xml version="1.0" encoding="utf-8"?>
-<w:hdr xmlns:o="urn:schemas-microsoft-com:office:office" xmlns:r="http://schemas.openxmlformats.org/officeDocument/2006/relationships" xmlns:v="urn:schemas-microsoft-com:vml" xmlns:w="http://schemas.openxmlformats.org/wordprocessingml/2006/main" xmlns:w10="urn:schemas-microsoft-com:office:word" xmlns:wp="http://schemas.openxmlformats.org/drawingml/2006/wordprocessingDrawing" xmlns:wps="http://schemas.microsoft.com/office/word/2010/wordprocessingShape" xmlns:wpg="http://schemas.microsoft.com/office/word/2010/wordprocessingGroup" xmlns:mc="http://schemas.openxmlformats.org/markup-compatibility/2006" xmlns:wp14="http://schemas.microsoft.com/office/word/2010/wordprocessingDrawing" xmlns:w14="http://schemas.microsoft.com/office/word/2010/wordml" xmlns:w15="http://schemas.microsoft.com/office/word/2012/wordml" mc:Ignorable="w14 wp14 w15">
-  <w:p>
-    <w:pPr>
-      <w:pStyle w:val="Normal"/>
       <w:tabs>
-        <w:tab w:val="clear" w:pos="720"/>
-        <w:tab w:val="center" w:pos="4680" w:leader="none"/>
-        <w:tab w:val="right" w:pos="9360" w:leader="none"/>
+        <w:tab w:val="center" w:pos="4680"/>
+        <w:tab w:val="right" w:pos="9360"/>
       </w:tabs>
-      <w:spacing w:lineRule="auto" w:line="240" w:before="0" w:after="0"/>
+      <w:spacing w:after="0" w:line="240" w:lineRule="auto"/>
       <w:rPr>
         <w:color w:val="000000"/>
       </w:rPr>
     </w:pPr>
     <w:r>
-      <w:rPr/>
+      <w:rPr>
+        <w:noProof/>
+        <w:lang w:val="en-PH" w:eastAsia="en-PH"/>
+      </w:rPr>
       <w:drawing>
         <wp:inline distT="0" distB="0" distL="0" distR="0">
           <wp:extent cx="3653155" cy="541655"/>
           <wp:effectExtent l="0" t="0" r="0" b="0"/>
-          <wp:docPr id="1" name="image1.png" descr="" title=""/>
+          <wp:docPr id="3" name="image1.png"/>
           <wp:cNvGraphicFramePr>
             <a:graphicFrameLocks xmlns:a="http://schemas.openxmlformats.org/drawingml/2006/main" noChangeAspect="1"/>
           </wp:cNvGraphicFramePr>
@@ -1806,7 +2126,7 @@
             <a:graphicData uri="http://schemas.openxmlformats.org/drawingml/2006/picture">
               <pic:pic xmlns:pic="http://schemas.openxmlformats.org/drawingml/2006/picture">
                 <pic:nvPicPr>
-                  <pic:cNvPr id="1" name="image1.png" descr="" title=""/>
+                  <pic:cNvPr id="1" name="image1.png"/>
                   <pic:cNvPicPr>
                     <a:picLocks noChangeAspect="1" noChangeArrowheads="1"/>
                   </pic:cNvPicPr>
@@ -1836,28 +2156,29 @@
 </w:hdr>
 </file>
 
-<file path=word/header3.xml><?xml version="1.0" encoding="utf-8"?>
-<w:hdr xmlns:o="urn:schemas-microsoft-com:office:office" xmlns:r="http://schemas.openxmlformats.org/officeDocument/2006/relationships" xmlns:v="urn:schemas-microsoft-com:vml" xmlns:w="http://schemas.openxmlformats.org/wordprocessingml/2006/main" xmlns:w10="urn:schemas-microsoft-com:office:word" xmlns:wp="http://schemas.openxmlformats.org/drawingml/2006/wordprocessingDrawing" xmlns:wps="http://schemas.microsoft.com/office/word/2010/wordprocessingShape" xmlns:wpg="http://schemas.microsoft.com/office/word/2010/wordprocessingGroup" xmlns:mc="http://schemas.openxmlformats.org/markup-compatibility/2006" xmlns:wp14="http://schemas.microsoft.com/office/word/2010/wordprocessingDrawing" xmlns:w14="http://schemas.microsoft.com/office/word/2010/wordml" xmlns:w15="http://schemas.microsoft.com/office/word/2012/wordml" mc:Ignorable="w14 wp14 w15">
+<file path=word/header2.xml><?xml version="1.0" encoding="utf-8"?>
+<w:hdr xmlns:wpc="http://schemas.microsoft.com/office/word/2010/wordprocessingCanvas" xmlns:cx="http://schemas.microsoft.com/office/drawing/2014/chartex" xmlns:mc="http://schemas.openxmlformats.org/markup-compatibility/2006" xmlns:o="urn:schemas-microsoft-com:office:office" xmlns:r="http://schemas.openxmlformats.org/officeDocument/2006/relationships" xmlns:m="http://schemas.openxmlformats.org/officeDocument/2006/math" xmlns:v="urn:schemas-microsoft-com:vml" xmlns:wp14="http://schemas.microsoft.com/office/word/2010/wordprocessingDrawing" xmlns:wp="http://schemas.openxmlformats.org/drawingml/2006/wordprocessingDrawing" xmlns:w10="urn:schemas-microsoft-com:office:word" xmlns:w="http://schemas.openxmlformats.org/wordprocessingml/2006/main" xmlns:w14="http://schemas.microsoft.com/office/word/2010/wordml" xmlns:w15="http://schemas.microsoft.com/office/word/2012/wordml" xmlns:w16se="http://schemas.microsoft.com/office/word/2015/wordml/symex" xmlns:wpg="http://schemas.microsoft.com/office/word/2010/wordprocessingGroup" xmlns:wpi="http://schemas.microsoft.com/office/word/2010/wordprocessingInk" xmlns:wne="http://schemas.microsoft.com/office/word/2006/wordml" xmlns:wps="http://schemas.microsoft.com/office/word/2010/wordprocessingShape" mc:Ignorable="w14 w15 w16se wp14">
   <w:p>
     <w:pPr>
-      <w:pStyle w:val="Normal"/>
       <w:tabs>
-        <w:tab w:val="clear" w:pos="720"/>
-        <w:tab w:val="center" w:pos="4680" w:leader="none"/>
-        <w:tab w:val="right" w:pos="9360" w:leader="none"/>
+        <w:tab w:val="center" w:pos="4680"/>
+        <w:tab w:val="right" w:pos="9360"/>
       </w:tabs>
-      <w:spacing w:lineRule="auto" w:line="240" w:before="0" w:after="0"/>
+      <w:spacing w:after="0" w:line="240" w:lineRule="auto"/>
       <w:rPr>
         <w:color w:val="000000"/>
       </w:rPr>
     </w:pPr>
     <w:r>
-      <w:rPr/>
+      <w:rPr>
+        <w:noProof/>
+        <w:lang w:val="en-PH" w:eastAsia="en-PH"/>
+      </w:rPr>
       <w:drawing>
         <wp:inline distT="0" distB="0" distL="0" distR="0">
           <wp:extent cx="3653155" cy="541655"/>
           <wp:effectExtent l="0" t="0" r="0" b="0"/>
-          <wp:docPr id="2" name="image1.png" descr="" title=""/>
+          <wp:docPr id="4" name="image1.png"/>
           <wp:cNvGraphicFramePr>
             <a:graphicFrameLocks xmlns:a="http://schemas.openxmlformats.org/drawingml/2006/main" noChangeAspect="1"/>
           </wp:cNvGraphicFramePr>
@@ -1865,7 +2186,7 @@
             <a:graphicData uri="http://schemas.openxmlformats.org/drawingml/2006/picture">
               <pic:pic xmlns:pic="http://schemas.openxmlformats.org/drawingml/2006/picture">
                 <pic:nvPicPr>
-                  <pic:cNvPr id="2" name="image1.png" descr="" title=""/>
+                  <pic:cNvPr id="2" name="image1.png"/>
                   <pic:cNvPicPr>
                     <a:picLocks noChangeAspect="1" noChangeArrowheads="1"/>
                   </pic:cNvPicPr>
@@ -1896,11 +2217,11 @@
 </file>
 
 <file path=word/styles.xml><?xml version="1.0" encoding="utf-8"?>
-<w:styles xmlns:w="http://schemas.openxmlformats.org/wordprocessingml/2006/main" xmlns:w14="http://schemas.microsoft.com/office/word/2010/wordml" xmlns:mc="http://schemas.openxmlformats.org/markup-compatibility/2006" mc:Ignorable="w14">
+<w:styles xmlns:mc="http://schemas.openxmlformats.org/markup-compatibility/2006" xmlns:r="http://schemas.openxmlformats.org/officeDocument/2006/relationships" xmlns:w="http://schemas.openxmlformats.org/wordprocessingml/2006/main" xmlns:w14="http://schemas.microsoft.com/office/word/2010/wordml" xmlns:w15="http://schemas.microsoft.com/office/word/2012/wordml" xmlns:w16se="http://schemas.microsoft.com/office/word/2015/wordml/symex" mc:Ignorable="w14 w15 w16se">
   <w:docDefaults>
     <w:rPrDefault>
       <w:rPr>
-        <w:rFonts w:ascii="Calibri" w:hAnsi="Calibri" w:eastAsia="Calibri" w:cs="Calibri"/>
+        <w:rFonts w:ascii="Calibri" w:eastAsia="Calibri" w:hAnsi="Calibri" w:cs="Calibri"/>
         <w:sz w:val="22"/>
         <w:szCs w:val="22"/>
         <w:lang w:val="en-US" w:eastAsia="en-US" w:bidi="ar-SA"/>
@@ -1908,21 +2229,21 @@
     </w:rPrDefault>
     <w:pPrDefault>
       <w:pPr>
-        <w:suppressAutoHyphens w:val="true"/>
+        <w:suppressAutoHyphens/>
       </w:pPr>
     </w:pPrDefault>
   </w:docDefaults>
   <w:latentStyles w:defLockedState="0" w:defUIPriority="99" w:defSemiHidden="0" w:defUnhideWhenUsed="0" w:defQFormat="0" w:count="371">
     <w:lsdException w:name="Normal" w:uiPriority="0" w:qFormat="1"/>
     <w:lsdException w:name="heading 1" w:uiPriority="9" w:qFormat="1"/>
-    <w:lsdException w:name="heading 2" w:uiPriority="9" w:semiHidden="1" w:unhideWhenUsed="1" w:qFormat="1"/>
-    <w:lsdException w:name="heading 3" w:uiPriority="9" w:semiHidden="1" w:unhideWhenUsed="1" w:qFormat="1"/>
-    <w:lsdException w:name="heading 4" w:uiPriority="9" w:semiHidden="1" w:unhideWhenUsed="1" w:qFormat="1"/>
-    <w:lsdException w:name="heading 5" w:uiPriority="9" w:semiHidden="1" w:unhideWhenUsed="1" w:qFormat="1"/>
-    <w:lsdException w:name="heading 6" w:uiPriority="9" w:semiHidden="1" w:unhideWhenUsed="1" w:qFormat="1"/>
-    <w:lsdException w:name="heading 7" w:uiPriority="9" w:semiHidden="1" w:unhideWhenUsed="1" w:qFormat="1"/>
-    <w:lsdException w:name="heading 8" w:uiPriority="9" w:semiHidden="1" w:unhideWhenUsed="1" w:qFormat="1"/>
-    <w:lsdException w:name="heading 9" w:uiPriority="9" w:semiHidden="1" w:unhideWhenUsed="1" w:qFormat="1"/>
+    <w:lsdException w:name="heading 2" w:semiHidden="1" w:uiPriority="9" w:unhideWhenUsed="1" w:qFormat="1"/>
+    <w:lsdException w:name="heading 3" w:semiHidden="1" w:uiPriority="9" w:unhideWhenUsed="1" w:qFormat="1"/>
+    <w:lsdException w:name="heading 4" w:semiHidden="1" w:uiPriority="9" w:unhideWhenUsed="1" w:qFormat="1"/>
+    <w:lsdException w:name="heading 5" w:semiHidden="1" w:uiPriority="9" w:unhideWhenUsed="1" w:qFormat="1"/>
+    <w:lsdException w:name="heading 6" w:semiHidden="1" w:uiPriority="9" w:unhideWhenUsed="1" w:qFormat="1"/>
+    <w:lsdException w:name="heading 7" w:semiHidden="1" w:uiPriority="9" w:unhideWhenUsed="1" w:qFormat="1"/>
+    <w:lsdException w:name="heading 8" w:semiHidden="1" w:uiPriority="9" w:unhideWhenUsed="1" w:qFormat="1"/>
+    <w:lsdException w:name="heading 9" w:semiHidden="1" w:uiPriority="9" w:unhideWhenUsed="1" w:qFormat="1"/>
     <w:lsdException w:name="index 1" w:semiHidden="1" w:unhideWhenUsed="1"/>
     <w:lsdException w:name="index 2" w:semiHidden="1" w:unhideWhenUsed="1"/>
     <w:lsdException w:name="index 3" w:semiHidden="1" w:unhideWhenUsed="1"/>
@@ -1932,22 +2253,22 @@
     <w:lsdException w:name="index 7" w:semiHidden="1" w:unhideWhenUsed="1"/>
     <w:lsdException w:name="index 8" w:semiHidden="1" w:unhideWhenUsed="1"/>
     <w:lsdException w:name="index 9" w:semiHidden="1" w:unhideWhenUsed="1"/>
-    <w:lsdException w:name="toc 1" w:uiPriority="39" w:semiHidden="1" w:unhideWhenUsed="1"/>
-    <w:lsdException w:name="toc 2" w:uiPriority="39" w:semiHidden="1" w:unhideWhenUsed="1"/>
-    <w:lsdException w:name="toc 3" w:uiPriority="39" w:semiHidden="1" w:unhideWhenUsed="1"/>
-    <w:lsdException w:name="toc 4" w:uiPriority="39" w:semiHidden="1" w:unhideWhenUsed="1"/>
-    <w:lsdException w:name="toc 5" w:uiPriority="39" w:semiHidden="1" w:unhideWhenUsed="1"/>
-    <w:lsdException w:name="toc 6" w:uiPriority="39" w:semiHidden="1" w:unhideWhenUsed="1"/>
-    <w:lsdException w:name="toc 7" w:uiPriority="39" w:semiHidden="1" w:unhideWhenUsed="1"/>
-    <w:lsdException w:name="toc 8" w:uiPriority="39" w:semiHidden="1" w:unhideWhenUsed="1"/>
-    <w:lsdException w:name="toc 9" w:uiPriority="39" w:semiHidden="1" w:unhideWhenUsed="1"/>
+    <w:lsdException w:name="toc 1" w:semiHidden="1" w:uiPriority="39" w:unhideWhenUsed="1"/>
+    <w:lsdException w:name="toc 2" w:semiHidden="1" w:uiPriority="39" w:unhideWhenUsed="1"/>
+    <w:lsdException w:name="toc 3" w:semiHidden="1" w:uiPriority="39" w:unhideWhenUsed="1"/>
+    <w:lsdException w:name="toc 4" w:semiHidden="1" w:uiPriority="39" w:unhideWhenUsed="1"/>
+    <w:lsdException w:name="toc 5" w:semiHidden="1" w:uiPriority="39" w:unhideWhenUsed="1"/>
+    <w:lsdException w:name="toc 6" w:semiHidden="1" w:uiPriority="39" w:unhideWhenUsed="1"/>
+    <w:lsdException w:name="toc 7" w:semiHidden="1" w:uiPriority="39" w:unhideWhenUsed="1"/>
+    <w:lsdException w:name="toc 8" w:semiHidden="1" w:uiPriority="39" w:unhideWhenUsed="1"/>
+    <w:lsdException w:name="toc 9" w:semiHidden="1" w:uiPriority="39" w:unhideWhenUsed="1"/>
     <w:lsdException w:name="Normal Indent" w:semiHidden="1" w:unhideWhenUsed="1"/>
     <w:lsdException w:name="footnote text" w:semiHidden="1" w:unhideWhenUsed="1"/>
     <w:lsdException w:name="annotation text" w:semiHidden="1" w:unhideWhenUsed="1"/>
     <w:lsdException w:name="header" w:semiHidden="1" w:unhideWhenUsed="1"/>
     <w:lsdException w:name="footer" w:semiHidden="1" w:unhideWhenUsed="1"/>
     <w:lsdException w:name="index heading" w:semiHidden="1" w:unhideWhenUsed="1"/>
-    <w:lsdException w:name="caption" w:uiPriority="35" w:semiHidden="1" w:unhideWhenUsed="1" w:qFormat="1"/>
+    <w:lsdException w:name="caption" w:semiHidden="1" w:uiPriority="35" w:unhideWhenUsed="1" w:qFormat="1"/>
     <w:lsdException w:name="table of figures" w:semiHidden="1" w:unhideWhenUsed="1"/>
     <w:lsdException w:name="envelope address" w:semiHidden="1" w:unhideWhenUsed="1"/>
     <w:lsdException w:name="envelope return" w:semiHidden="1" w:unhideWhenUsed="1"/>
@@ -1978,7 +2299,7 @@
     <w:lsdException w:name="Title" w:uiPriority="10" w:qFormat="1"/>
     <w:lsdException w:name="Closing" w:semiHidden="1" w:unhideWhenUsed="1"/>
     <w:lsdException w:name="Signature" w:semiHidden="1" w:unhideWhenUsed="1"/>
-    <w:lsdException w:name="Default Paragraph Font" w:uiPriority="1" w:semiHidden="1" w:unhideWhenUsed="1"/>
+    <w:lsdException w:name="Default Paragraph Font" w:semiHidden="1" w:uiPriority="1" w:unhideWhenUsed="1"/>
     <w:lsdException w:name="Body Text" w:semiHidden="1" w:unhideWhenUsed="1"/>
     <w:lsdException w:name="Body Text Indent" w:semiHidden="1" w:unhideWhenUsed="1"/>
     <w:lsdException w:name="List Continue" w:semiHidden="1" w:unhideWhenUsed="1"/>
@@ -2178,8 +2499,8 @@
     <w:lsdException w:name="Subtle Reference" w:uiPriority="31" w:qFormat="1"/>
     <w:lsdException w:name="Intense Reference" w:uiPriority="32" w:qFormat="1"/>
     <w:lsdException w:name="Book Title" w:uiPriority="33" w:qFormat="1"/>
-    <w:lsdException w:name="Bibliography" w:uiPriority="37" w:semiHidden="1" w:unhideWhenUsed="1"/>
-    <w:lsdException w:name="TOC Heading" w:uiPriority="39" w:semiHidden="1" w:unhideWhenUsed="1" w:qFormat="1"/>
+    <w:lsdException w:name="Bibliography" w:semiHidden="1" w:uiPriority="37" w:unhideWhenUsed="1"/>
+    <w:lsdException w:name="TOC Heading" w:semiHidden="1" w:uiPriority="39" w:unhideWhenUsed="1" w:qFormat="1"/>
     <w:lsdException w:name="Plain Table 1" w:uiPriority="41"/>
     <w:lsdException w:name="Plain Table 2" w:uiPriority="42"/>
     <w:lsdException w:name="Plain Table 3" w:uiPriority="43"/>
@@ -2285,33 +2606,21 @@
     <w:lsdException w:name="List Table 6 Colorful Accent 6" w:uiPriority="51"/>
     <w:lsdException w:name="List Table 7 Colorful Accent 6" w:uiPriority="52"/>
   </w:latentStyles>
-  <w:style w:type="paragraph" w:styleId="Normal" w:default="1">
+  <w:style w:type="paragraph" w:default="1" w:styleId="Normal">
     <w:name w:val="Normal"/>
     <w:qFormat/>
     <w:pPr>
-      <w:widowControl/>
-      <w:suppressAutoHyphens w:val="true"/>
-      <w:bidi w:val="0"/>
-      <w:spacing w:lineRule="auto" w:line="276" w:before="0" w:after="200"/>
-      <w:jc w:val="start"/>
+      <w:spacing w:after="200" w:line="276" w:lineRule="auto"/>
     </w:pPr>
-    <w:rPr>
-      <w:rFonts w:ascii="Calibri" w:hAnsi="Calibri" w:eastAsia="Calibri" w:cs="Calibri"/>
-      <w:color w:val="auto"/>
-      <w:kern w:val="0"/>
-      <w:sz w:val="22"/>
-      <w:szCs w:val="22"/>
-      <w:lang w:val="en-US" w:eastAsia="en-US" w:bidi="ar-SA"/>
-    </w:rPr>
   </w:style>
   <w:style w:type="paragraph" w:styleId="Heading1">
-    <w:name w:val="Heading 1"/>
+    <w:name w:val="heading 1"/>
     <w:basedOn w:val="Normal"/>
     <w:next w:val="Normal"/>
     <w:uiPriority w:val="9"/>
     <w:qFormat/>
     <w:pPr>
-      <w:keepNext w:val="true"/>
+      <w:keepNext/>
       <w:keepLines/>
       <w:spacing w:before="480" w:after="120"/>
       <w:outlineLvl w:val="0"/>
@@ -2323,7 +2632,7 @@
     </w:rPr>
   </w:style>
   <w:style w:type="paragraph" w:styleId="Heading2">
-    <w:name w:val="Heading 2"/>
+    <w:name w:val="heading 2"/>
     <w:basedOn w:val="Normal"/>
     <w:next w:val="Normal"/>
     <w:uiPriority w:val="9"/>
@@ -2331,18 +2640,18 @@
     <w:unhideWhenUsed/>
     <w:qFormat/>
     <w:pPr>
-      <w:widowControl w:val="false"/>
-      <w:spacing w:lineRule="auto" w:line="240" w:before="0" w:after="0"/>
-      <w:ind w:start="275"/>
+      <w:widowControl w:val="0"/>
+      <w:spacing w:after="0" w:line="240" w:lineRule="auto"/>
+      <w:ind w:left="275"/>
       <w:outlineLvl w:val="1"/>
     </w:pPr>
     <w:rPr>
-      <w:rFonts w:ascii="Cambria" w:hAnsi="Cambria" w:eastAsia="Cambria" w:cs="Cambria"/>
+      <w:rFonts w:ascii="Cambria" w:eastAsia="Cambria" w:hAnsi="Cambria" w:cs="Cambria"/>
       <w:b/>
     </w:rPr>
   </w:style>
   <w:style w:type="paragraph" w:styleId="Heading3">
-    <w:name w:val="Heading 3"/>
+    <w:name w:val="heading 3"/>
     <w:basedOn w:val="Normal"/>
     <w:next w:val="Normal"/>
     <w:uiPriority w:val="9"/>
@@ -2350,7 +2659,7 @@
     <w:unhideWhenUsed/>
     <w:qFormat/>
     <w:pPr>
-      <w:keepNext w:val="true"/>
+      <w:keepNext/>
       <w:keepLines/>
       <w:spacing w:before="280" w:after="80"/>
       <w:outlineLvl w:val="2"/>
@@ -2362,7 +2671,7 @@
     </w:rPr>
   </w:style>
   <w:style w:type="paragraph" w:styleId="Heading4">
-    <w:name w:val="Heading 4"/>
+    <w:name w:val="heading 4"/>
     <w:basedOn w:val="Normal"/>
     <w:next w:val="Normal"/>
     <w:uiPriority w:val="9"/>
@@ -2370,7 +2679,7 @@
     <w:unhideWhenUsed/>
     <w:qFormat/>
     <w:pPr>
-      <w:keepNext w:val="true"/>
+      <w:keepNext/>
       <w:keepLines/>
       <w:spacing w:before="240" w:after="40"/>
       <w:outlineLvl w:val="3"/>
@@ -2382,7 +2691,7 @@
     </w:rPr>
   </w:style>
   <w:style w:type="paragraph" w:styleId="Heading5">
-    <w:name w:val="Heading 5"/>
+    <w:name w:val="heading 5"/>
     <w:basedOn w:val="Normal"/>
     <w:next w:val="Normal"/>
     <w:uiPriority w:val="9"/>
@@ -2390,7 +2699,7 @@
     <w:unhideWhenUsed/>
     <w:qFormat/>
     <w:pPr>
-      <w:keepNext w:val="true"/>
+      <w:keepNext/>
       <w:keepLines/>
       <w:spacing w:before="220" w:after="40"/>
       <w:outlineLvl w:val="4"/>
@@ -2400,7 +2709,7 @@
     </w:rPr>
   </w:style>
   <w:style w:type="paragraph" w:styleId="Heading6">
-    <w:name w:val="Heading 6"/>
+    <w:name w:val="heading 6"/>
     <w:basedOn w:val="Normal"/>
     <w:next w:val="Normal"/>
     <w:uiPriority w:val="9"/>
@@ -2408,7 +2717,7 @@
     <w:unhideWhenUsed/>
     <w:qFormat/>
     <w:pPr>
-      <w:keepNext w:val="true"/>
+      <w:keepNext/>
       <w:keepLines/>
       <w:spacing w:before="200" w:after="40"/>
       <w:outlineLvl w:val="5"/>
@@ -2419,25 +2728,44 @@
       <w:szCs w:val="20"/>
     </w:rPr>
   </w:style>
-  <w:style w:type="character" w:styleId="DefaultParagraphFont" w:default="1">
+  <w:style w:type="character" w:default="1" w:styleId="DefaultParagraphFont">
     <w:name w:val="Default Paragraph Font"/>
     <w:uiPriority w:val="1"/>
     <w:semiHidden/>
     <w:unhideWhenUsed/>
-    <w:qFormat/>
-    <w:rPr/>
   </w:style>
-  <w:style w:type="paragraph" w:styleId="Heading">
+  <w:style w:type="table" w:default="1" w:styleId="TableNormal">
+    <w:name w:val="Normal Table"/>
+    <w:uiPriority w:val="99"/>
+    <w:semiHidden/>
+    <w:unhideWhenUsed/>
+    <w:tblPr>
+      <w:tblInd w:w="0" w:type="dxa"/>
+      <w:tblCellMar>
+        <w:top w:w="0" w:type="dxa"/>
+        <w:left w:w="108" w:type="dxa"/>
+        <w:bottom w:w="0" w:type="dxa"/>
+        <w:right w:w="108" w:type="dxa"/>
+      </w:tblCellMar>
+    </w:tblPr>
+  </w:style>
+  <w:style w:type="numbering" w:default="1" w:styleId="NoList">
+    <w:name w:val="No List"/>
+    <w:uiPriority w:val="99"/>
+    <w:semiHidden/>
+    <w:unhideWhenUsed/>
+  </w:style>
+  <w:style w:type="paragraph" w:customStyle="1" w:styleId="Heading">
     <w:name w:val="Heading"/>
     <w:basedOn w:val="Normal"/>
     <w:next w:val="BodyText"/>
     <w:qFormat/>
     <w:pPr>
-      <w:keepNext w:val="true"/>
+      <w:keepNext/>
       <w:spacing w:before="240" w:after="120"/>
     </w:pPr>
     <w:rPr>
-      <w:rFonts w:ascii="Liberation Sans" w:hAnsi="Liberation Sans" w:eastAsia="Microsoft YaHei" w:cs="Arial"/>
+      <w:rFonts w:ascii="Liberation Sans" w:eastAsia="Microsoft YaHei" w:hAnsi="Liberation Sans" w:cs="Arial"/>
       <w:sz w:val="28"/>
       <w:szCs w:val="28"/>
     </w:rPr>
@@ -2446,20 +2774,18 @@
     <w:name w:val="Body Text"/>
     <w:basedOn w:val="Normal"/>
     <w:pPr>
-      <w:spacing w:lineRule="auto" w:line="276" w:before="0" w:after="140"/>
+      <w:spacing w:after="140"/>
     </w:pPr>
-    <w:rPr/>
   </w:style>
   <w:style w:type="paragraph" w:styleId="List">
     <w:name w:val="List"/>
     <w:basedOn w:val="BodyText"/>
-    <w:pPr/>
     <w:rPr>
       <w:rFonts w:cs="Arial"/>
     </w:rPr>
   </w:style>
   <w:style w:type="paragraph" w:styleId="Caption">
-    <w:name w:val="Caption"/>
+    <w:name w:val="caption"/>
     <w:basedOn w:val="Normal"/>
     <w:qFormat/>
     <w:pPr>
@@ -2474,7 +2800,7 @@
       <w:szCs w:val="24"/>
     </w:rPr>
   </w:style>
-  <w:style w:type="paragraph" w:styleId="Index">
+  <w:style w:type="paragraph" w:customStyle="1" w:styleId="Index">
     <w:name w:val="Index"/>
     <w:basedOn w:val="Normal"/>
     <w:qFormat/>
@@ -2492,7 +2818,7 @@
     <w:uiPriority w:val="10"/>
     <w:qFormat/>
     <w:pPr>
-      <w:keepNext w:val="true"/>
+      <w:keepNext/>
       <w:keepLines/>
       <w:spacing w:before="480" w:after="120"/>
     </w:pPr>
@@ -2509,97 +2835,86 @@
     <w:uiPriority w:val="11"/>
     <w:qFormat/>
     <w:pPr>
-      <w:keepNext w:val="true"/>
+      <w:keepNext/>
       <w:keepLines/>
       <w:spacing w:before="360" w:after="80"/>
     </w:pPr>
     <w:rPr>
-      <w:rFonts w:ascii="Georgia" w:hAnsi="Georgia" w:eastAsia="Georgia" w:cs="Georgia"/>
+      <w:rFonts w:ascii="Georgia" w:eastAsia="Georgia" w:hAnsi="Georgia" w:cs="Georgia"/>
       <w:i/>
       <w:color w:val="666666"/>
       <w:sz w:val="48"/>
       <w:szCs w:val="48"/>
     </w:rPr>
   </w:style>
-  <w:style w:type="paragraph" w:styleId="HeaderandFooter">
+  <w:style w:type="paragraph" w:customStyle="1" w:styleId="HeaderandFooter">
     <w:name w:val="Header and Footer"/>
     <w:basedOn w:val="Normal"/>
     <w:qFormat/>
-    <w:pPr/>
-    <w:rPr/>
   </w:style>
   <w:style w:type="paragraph" w:styleId="Header">
-    <w:name w:val="Header"/>
+    <w:name w:val="header"/>
     <w:basedOn w:val="HeaderandFooter"/>
-    <w:pPr/>
-    <w:rPr/>
   </w:style>
   <w:style w:type="paragraph" w:styleId="Footer">
-    <w:name w:val="Footer"/>
+    <w:name w:val="footer"/>
     <w:basedOn w:val="HeaderandFooter"/>
-    <w:pPr/>
-    <w:rPr/>
   </w:style>
-  <w:style w:type="numbering" w:styleId="NoList" w:default="1">
-    <w:name w:val="No List"/>
-    <w:uiPriority w:val="99"/>
-    <w:semiHidden/>
-    <w:unhideWhenUsed/>
-    <w:qFormat/>
-  </w:style>
-  <w:style w:type="table" w:default="1" w:styleId="TableNormal">
-    <w:name w:val="Normal Table"/>
-    <w:uiPriority w:val="99"/>
-    <w:semiHidden/>
-    <w:unhideWhenUsed/>
+  <w:style w:type="table" w:styleId="TableGrid">
+    <w:name w:val="Table Grid"/>
+    <w:basedOn w:val="TableNormal"/>
+    <w:uiPriority w:val="39"/>
+    <w:rsid w:val="001A571B"/>
     <w:tblPr>
-      <w:tblCellMar>
-        <w:top w:w="0" w:type="dxa"/>
-        <w:left w:w="108" w:type="dxa"/>
-        <w:bottom w:w="0" w:type="dxa"/>
-        <w:right w:w="108" w:type="dxa"/>
-      </w:tblCellMar>
+      <w:tblBorders>
+        <w:top w:val="single" w:sz="4" w:space="0" w:color="auto"/>
+        <w:left w:val="single" w:sz="4" w:space="0" w:color="auto"/>
+        <w:bottom w:val="single" w:sz="4" w:space="0" w:color="auto"/>
+        <w:right w:val="single" w:sz="4" w:space="0" w:color="auto"/>
+        <w:insideH w:val="single" w:sz="4" w:space="0" w:color="auto"/>
+        <w:insideV w:val="single" w:sz="4" w:space="0" w:color="auto"/>
+      </w:tblBorders>
     </w:tblPr>
   </w:style>
 </w:styles>
 </file>
 
 <file path=word/theme/theme1.xml><?xml version="1.0" encoding="utf-8"?>
-<a:theme xmlns:a="http://schemas.openxmlformats.org/drawingml/2006/main" xmlns:r="http://schemas.openxmlformats.org/officeDocument/2006/relationships" name="Office Theme">
+<a:theme xmlns:a="http://schemas.openxmlformats.org/drawingml/2006/main" name="Office Theme">
   <a:themeElements>
     <a:clrScheme name="Office">
       <a:dk1>
         <a:srgbClr val="000000"/>
       </a:dk1>
       <a:lt1>
-        <a:srgbClr val="ffffff"/>
+        <a:srgbClr val="FFFFFF"/>
       </a:lt1>
       <a:dk2>
-        <a:srgbClr val="1f497d"/>
+        <a:srgbClr val="1F497D"/>
       </a:dk2>
       <a:lt2>
-        <a:srgbClr val="eeece1"/>
+        <a:srgbClr val="EEECE1"/>
       </a:lt2>
       <a:accent1>
-        <a:srgbClr val="4f81bd"/>
+        <a:srgbClr val="4F81BD"/>
       </a:accent1>
       <a:accent2>
-        <a:srgbClr val="c0504d"/>
+        <a:srgbClr val="C0504D"/>
       </a:accent2>
       <a:accent3>
-        <a:srgbClr val="9bbb59"/>
+        <a:srgbClr val="9BBB59"/>
       </a:accent3>
       <a:accent4>
-        <a:srgbClr val="8064a2"/>
+        <a:srgbClr val="8064A2"/>
       </a:accent4>
       <a:accent5>
-        <a:srgbClr val="4bacc6"/>
+        <a:srgbClr val="4BACC6"/>
       </a:accent5>
       <a:accent6>
-        <a:srgbClr val="f79646"/>
+        <a:srgbClr val="F79646"/>
       </a:accent6>
       <a:hlink>
-        <a:srgbClr val="0000ff"/>
+        <a:srgbClr val="0000FF"/>
       </a:hlink>
       <a:folHlink>
         <a:srgbClr val="800080"/>
@@ -2607,12 +2922,12 @@
     </a:clrScheme>
     <a:fontScheme name="Office">
       <a:majorFont>
-        <a:latin typeface="Calibri" pitchFamily="0" charset="1"/>
+        <a:latin typeface="Calibri"/>
         <a:ea typeface=""/>
         <a:cs typeface=""/>
       </a:majorFont>
       <a:minorFont>
-        <a:latin typeface="Cambria" pitchFamily="0" charset="1"/>
+        <a:latin typeface="Cambria"/>
         <a:ea typeface=""/>
         <a:cs typeface=""/>
       </a:minorFont>
@@ -2641,7 +2956,7 @@
             </a:gs>
           </a:gsLst>
           <a:lin ang="16200000" scaled="1"/>
-          <a:tileRect l="0" t="0" r="0" b="0"/>
+          <a:tileRect/>
         </a:gradFill>
         <a:gradFill>
           <a:gsLst>
@@ -2659,7 +2974,7 @@
             </a:gs>
           </a:gsLst>
           <a:lin ang="16200000" scaled="0"/>
-          <a:tileRect l="0" t="0" r="0" b="0"/>
+          <a:tileRect/>
         </a:gradFill>
       </a:fillStyleLst>
       <a:lnStyleLst>
@@ -2710,7 +3025,7 @@
           <a:path path="circle">
             <a:fillToRect l="50000" t="-80000" r="50000" b="180000"/>
           </a:path>
-          <a:tileRect l="0" t="0" r="0" b="0"/>
+          <a:tileRect/>
         </a:gradFill>
         <a:gradFill>
           <a:gsLst>
@@ -2728,10 +3043,24 @@
           <a:path path="circle">
             <a:fillToRect l="50000" t="50000" r="50000" b="50000"/>
           </a:path>
-          <a:tileRect l="0" t="0" r="0" b="0"/>
+          <a:tileRect/>
         </a:gradFill>
       </a:bgFillStyleLst>
     </a:fmtScheme>
   </a:themeElements>
+  <a:objectDefaults/>
+  <a:extraClrSchemeLst/>
 </a:theme>
+</file>
+
+<file path=customXml/item1.xml><?xml version="1.0" encoding="utf-8"?>
+<b:Sources xmlns:b="http://schemas.openxmlformats.org/officeDocument/2006/bibliography" xmlns="http://schemas.openxmlformats.org/officeDocument/2006/bibliography" SelectedStyle="\APASixthEditionOfficeOnline.xsl" StyleName="APA" Version="6"/>
+</file>
+
+<file path=customXml/itemProps1.xml><?xml version="1.0" encoding="utf-8"?>
+<ds:datastoreItem xmlns:ds="http://schemas.openxmlformats.org/officeDocument/2006/customXml" ds:itemID="{8A65F5DB-80EB-44A5-8EE5-EF42E80C14C9}">
+  <ds:schemaRefs>
+    <ds:schemaRef ds:uri="http://schemas.openxmlformats.org/officeDocument/2006/bibliography"/>
+  </ds:schemaRefs>
+</ds:datastoreItem>
 </file>
</xml_diff>